<commit_message>
Student session in the thesis and the guion: chapter 9 results, fifth grade, impersonal voice, consent form as Annex F, plainer guion vocabulary with its change-control row, efficacy 97.0 % (INC-151, INC-157)
</commit_message>
<xml_diff>
--- a/docs/Solucion_OE2_Diseno_final.docx
+++ b/docs/Solucion_OE2_Diseno_final.docx
@@ -34,7 +34,7 @@
           <w:r>
             <w:fldChar w:fldCharType="separate"/>
           </w:r>
-          <w:hyperlink w:anchor="_Toc242442850" w:history="1">
+          <w:hyperlink w:anchor="_Toc242804619" w:history="1">
             <w:r>
               <w:rPr>
                 <w:rStyle w:val="Hipervnculo"/>
@@ -61,7 +61,7 @@
                 <w:noProof/>
                 <w:webHidden/>
               </w:rPr>
-              <w:instrText xml:space="preserve"> PAGEREF _Toc242442850 \h </w:instrText>
+              <w:instrText xml:space="preserve"> PAGEREF _Toc242804619 \h </w:instrText>
             </w:r>
             <w:r>
               <w:rPr>
@@ -105,7 +105,7 @@
               <w14:ligatures w14:val="standardContextual"/>
             </w:rPr>
           </w:pPr>
-          <w:hyperlink w:anchor="_Toc242442851" w:history="1">
+          <w:hyperlink w:anchor="_Toc242804620" w:history="1">
             <w:r>
               <w:rPr>
                 <w:rStyle w:val="Hipervnculo"/>
@@ -132,7 +132,7 @@
                 <w:noProof/>
                 <w:webHidden/>
               </w:rPr>
-              <w:instrText xml:space="preserve"> PAGEREF _Toc242442851 \h </w:instrText>
+              <w:instrText xml:space="preserve"> PAGEREF _Toc242804620 \h </w:instrText>
             </w:r>
             <w:r>
               <w:rPr>
@@ -176,7 +176,7 @@
               <w14:ligatures w14:val="standardContextual"/>
             </w:rPr>
           </w:pPr>
-          <w:hyperlink w:anchor="_Toc242442852" w:history="1">
+          <w:hyperlink w:anchor="_Toc242804621" w:history="1">
             <w:r>
               <w:rPr>
                 <w:rStyle w:val="Hipervnculo"/>
@@ -203,7 +203,7 @@
                 <w:noProof/>
                 <w:webHidden/>
               </w:rPr>
-              <w:instrText xml:space="preserve"> PAGEREF _Toc242442852 \h </w:instrText>
+              <w:instrText xml:space="preserve"> PAGEREF _Toc242804621 \h </w:instrText>
             </w:r>
             <w:r>
               <w:rPr>
@@ -247,7 +247,7 @@
               <w14:ligatures w14:val="standardContextual"/>
             </w:rPr>
           </w:pPr>
-          <w:hyperlink w:anchor="_Toc242442853" w:history="1">
+          <w:hyperlink w:anchor="_Toc242804622" w:history="1">
             <w:r>
               <w:rPr>
                 <w:rStyle w:val="Hipervnculo"/>
@@ -274,7 +274,7 @@
                 <w:noProof/>
                 <w:webHidden/>
               </w:rPr>
-              <w:instrText xml:space="preserve"> PAGEREF _Toc242442853 \h </w:instrText>
+              <w:instrText xml:space="preserve"> PAGEREF _Toc242804622 \h </w:instrText>
             </w:r>
             <w:r>
               <w:rPr>
@@ -318,7 +318,7 @@
               <w14:ligatures w14:val="standardContextual"/>
             </w:rPr>
           </w:pPr>
-          <w:hyperlink w:anchor="_Toc242442854" w:history="1">
+          <w:hyperlink w:anchor="_Toc242804623" w:history="1">
             <w:r>
               <w:rPr>
                 <w:rStyle w:val="Hipervnculo"/>
@@ -345,7 +345,7 @@
                 <w:noProof/>
                 <w:webHidden/>
               </w:rPr>
-              <w:instrText xml:space="preserve"> PAGEREF _Toc242442854 \h </w:instrText>
+              <w:instrText xml:space="preserve"> PAGEREF _Toc242804623 \h </w:instrText>
             </w:r>
             <w:r>
               <w:rPr>
@@ -389,7 +389,7 @@
               <w14:ligatures w14:val="standardContextual"/>
             </w:rPr>
           </w:pPr>
-          <w:hyperlink w:anchor="_Toc242442855" w:history="1">
+          <w:hyperlink w:anchor="_Toc242804624" w:history="1">
             <w:r>
               <w:rPr>
                 <w:rStyle w:val="Hipervnculo"/>
@@ -417,7 +417,7 @@
                 <w:noProof/>
                 <w:webHidden/>
               </w:rPr>
-              <w:instrText xml:space="preserve"> PAGEREF _Toc242442855 \h </w:instrText>
+              <w:instrText xml:space="preserve"> PAGEREF _Toc242804624 \h </w:instrText>
             </w:r>
             <w:r>
               <w:rPr>
@@ -461,7 +461,7 @@
               <w14:ligatures w14:val="standardContextual"/>
             </w:rPr>
           </w:pPr>
-          <w:hyperlink w:anchor="_Toc242442856" w:history="1">
+          <w:hyperlink w:anchor="_Toc242804625" w:history="1">
             <w:r>
               <w:rPr>
                 <w:rStyle w:val="Hipervnculo"/>
@@ -488,7 +488,7 @@
                 <w:noProof/>
                 <w:webHidden/>
               </w:rPr>
-              <w:instrText xml:space="preserve"> PAGEREF _Toc242442856 \h </w:instrText>
+              <w:instrText xml:space="preserve"> PAGEREF _Toc242804625 \h </w:instrText>
             </w:r>
             <w:r>
               <w:rPr>
@@ -532,7 +532,7 @@
               <w14:ligatures w14:val="standardContextual"/>
             </w:rPr>
           </w:pPr>
-          <w:hyperlink w:anchor="_Toc242442857" w:history="1">
+          <w:hyperlink w:anchor="_Toc242804626" w:history="1">
             <w:r>
               <w:rPr>
                 <w:rStyle w:val="Hipervnculo"/>
@@ -559,7 +559,7 @@
                 <w:noProof/>
                 <w:webHidden/>
               </w:rPr>
-              <w:instrText xml:space="preserve"> PAGEREF _Toc242442857 \h </w:instrText>
+              <w:instrText xml:space="preserve"> PAGEREF _Toc242804626 \h </w:instrText>
             </w:r>
             <w:r>
               <w:rPr>
@@ -603,7 +603,7 @@
               <w14:ligatures w14:val="standardContextual"/>
             </w:rPr>
           </w:pPr>
-          <w:hyperlink w:anchor="_Toc242442858" w:history="1">
+          <w:hyperlink w:anchor="_Toc242804627" w:history="1">
             <w:r>
               <w:rPr>
                 <w:rStyle w:val="Hipervnculo"/>
@@ -630,7 +630,7 @@
                 <w:noProof/>
                 <w:webHidden/>
               </w:rPr>
-              <w:instrText xml:space="preserve"> PAGEREF _Toc242442858 \h </w:instrText>
+              <w:instrText xml:space="preserve"> PAGEREF _Toc242804627 \h </w:instrText>
             </w:r>
             <w:r>
               <w:rPr>
@@ -674,7 +674,7 @@
               <w14:ligatures w14:val="standardContextual"/>
             </w:rPr>
           </w:pPr>
-          <w:hyperlink w:anchor="_Toc242442859" w:history="1">
+          <w:hyperlink w:anchor="_Toc242804628" w:history="1">
             <w:r>
               <w:rPr>
                 <w:rStyle w:val="Hipervnculo"/>
@@ -701,7 +701,7 @@
                 <w:noProof/>
                 <w:webHidden/>
               </w:rPr>
-              <w:instrText xml:space="preserve"> PAGEREF _Toc242442859 \h </w:instrText>
+              <w:instrText xml:space="preserve"> PAGEREF _Toc242804628 \h </w:instrText>
             </w:r>
             <w:r>
               <w:rPr>
@@ -745,7 +745,7 @@
               <w14:ligatures w14:val="standardContextual"/>
             </w:rPr>
           </w:pPr>
-          <w:hyperlink w:anchor="_Toc242442860" w:history="1">
+          <w:hyperlink w:anchor="_Toc242804629" w:history="1">
             <w:r>
               <w:rPr>
                 <w:rStyle w:val="Hipervnculo"/>
@@ -772,7 +772,7 @@
                 <w:noProof/>
                 <w:webHidden/>
               </w:rPr>
-              <w:instrText xml:space="preserve"> PAGEREF _Toc242442860 \h </w:instrText>
+              <w:instrText xml:space="preserve"> PAGEREF _Toc242804629 \h </w:instrText>
             </w:r>
             <w:r>
               <w:rPr>
@@ -816,7 +816,7 @@
               <w14:ligatures w14:val="standardContextual"/>
             </w:rPr>
           </w:pPr>
-          <w:hyperlink w:anchor="_Toc242442861" w:history="1">
+          <w:hyperlink w:anchor="_Toc242804630" w:history="1">
             <w:r>
               <w:rPr>
                 <w:rStyle w:val="Hipervnculo"/>
@@ -843,7 +843,7 @@
                 <w:noProof/>
                 <w:webHidden/>
               </w:rPr>
-              <w:instrText xml:space="preserve"> PAGEREF _Toc242442861 \h </w:instrText>
+              <w:instrText xml:space="preserve"> PAGEREF _Toc242804630 \h </w:instrText>
             </w:r>
             <w:r>
               <w:rPr>
@@ -887,7 +887,7 @@
               <w14:ligatures w14:val="standardContextual"/>
             </w:rPr>
           </w:pPr>
-          <w:hyperlink w:anchor="_Toc242442862" w:history="1">
+          <w:hyperlink w:anchor="_Toc242804631" w:history="1">
             <w:r>
               <w:rPr>
                 <w:rStyle w:val="Hipervnculo"/>
@@ -914,7 +914,7 @@
                 <w:noProof/>
                 <w:webHidden/>
               </w:rPr>
-              <w:instrText xml:space="preserve"> PAGEREF _Toc242442862 \h </w:instrText>
+              <w:instrText xml:space="preserve"> PAGEREF _Toc242804631 \h </w:instrText>
             </w:r>
             <w:r>
               <w:rPr>
@@ -958,7 +958,7 @@
               <w14:ligatures w14:val="standardContextual"/>
             </w:rPr>
           </w:pPr>
-          <w:hyperlink w:anchor="_Toc242442863" w:history="1">
+          <w:hyperlink w:anchor="_Toc242804632" w:history="1">
             <w:r>
               <w:rPr>
                 <w:rStyle w:val="Hipervnculo"/>
@@ -985,7 +985,7 @@
                 <w:noProof/>
                 <w:webHidden/>
               </w:rPr>
-              <w:instrText xml:space="preserve"> PAGEREF _Toc242442863 \h </w:instrText>
+              <w:instrText xml:space="preserve"> PAGEREF _Toc242804632 \h </w:instrText>
             </w:r>
             <w:r>
               <w:rPr>
@@ -1029,7 +1029,7 @@
               <w14:ligatures w14:val="standardContextual"/>
             </w:rPr>
           </w:pPr>
-          <w:hyperlink w:anchor="_Toc242442864" w:history="1">
+          <w:hyperlink w:anchor="_Toc242804633" w:history="1">
             <w:r>
               <w:rPr>
                 <w:rStyle w:val="Hipervnculo"/>
@@ -1056,7 +1056,7 @@
                 <w:noProof/>
                 <w:webHidden/>
               </w:rPr>
-              <w:instrText xml:space="preserve"> PAGEREF _Toc242442864 \h </w:instrText>
+              <w:instrText xml:space="preserve"> PAGEREF _Toc242804633 \h </w:instrText>
             </w:r>
             <w:r>
               <w:rPr>
@@ -1100,7 +1100,7 @@
               <w14:ligatures w14:val="standardContextual"/>
             </w:rPr>
           </w:pPr>
-          <w:hyperlink w:anchor="_Toc242442865" w:history="1">
+          <w:hyperlink w:anchor="_Toc242804634" w:history="1">
             <w:r>
               <w:rPr>
                 <w:rStyle w:val="Hipervnculo"/>
@@ -1127,7 +1127,7 @@
                 <w:noProof/>
                 <w:webHidden/>
               </w:rPr>
-              <w:instrText xml:space="preserve"> PAGEREF _Toc242442865 \h </w:instrText>
+              <w:instrText xml:space="preserve"> PAGEREF _Toc242804634 \h </w:instrText>
             </w:r>
             <w:r>
               <w:rPr>
@@ -1171,7 +1171,7 @@
               <w14:ligatures w14:val="standardContextual"/>
             </w:rPr>
           </w:pPr>
-          <w:hyperlink w:anchor="_Toc242442866" w:history="1">
+          <w:hyperlink w:anchor="_Toc242804635" w:history="1">
             <w:r>
               <w:rPr>
                 <w:rStyle w:val="Hipervnculo"/>
@@ -1198,7 +1198,7 @@
                 <w:noProof/>
                 <w:webHidden/>
               </w:rPr>
-              <w:instrText xml:space="preserve"> PAGEREF _Toc242442866 \h </w:instrText>
+              <w:instrText xml:space="preserve"> PAGEREF _Toc242804635 \h </w:instrText>
             </w:r>
             <w:r>
               <w:rPr>
@@ -1242,7 +1242,7 @@
               <w14:ligatures w14:val="standardContextual"/>
             </w:rPr>
           </w:pPr>
-          <w:hyperlink w:anchor="_Toc242442867" w:history="1">
+          <w:hyperlink w:anchor="_Toc242804636" w:history="1">
             <w:r>
               <w:rPr>
                 <w:rStyle w:val="Hipervnculo"/>
@@ -1269,7 +1269,7 @@
                 <w:noProof/>
                 <w:webHidden/>
               </w:rPr>
-              <w:instrText xml:space="preserve"> PAGEREF _Toc242442867 \h </w:instrText>
+              <w:instrText xml:space="preserve"> PAGEREF _Toc242804636 \h </w:instrText>
             </w:r>
             <w:r>
               <w:rPr>
@@ -1313,7 +1313,7 @@
               <w14:ligatures w14:val="standardContextual"/>
             </w:rPr>
           </w:pPr>
-          <w:hyperlink w:anchor="_Toc242442868" w:history="1">
+          <w:hyperlink w:anchor="_Toc242804637" w:history="1">
             <w:r>
               <w:rPr>
                 <w:rStyle w:val="Hipervnculo"/>
@@ -1340,7 +1340,7 @@
                 <w:noProof/>
                 <w:webHidden/>
               </w:rPr>
-              <w:instrText xml:space="preserve"> PAGEREF _Toc242442868 \h </w:instrText>
+              <w:instrText xml:space="preserve"> PAGEREF _Toc242804637 \h </w:instrText>
             </w:r>
             <w:r>
               <w:rPr>
@@ -1384,7 +1384,7 @@
               <w14:ligatures w14:val="standardContextual"/>
             </w:rPr>
           </w:pPr>
-          <w:hyperlink w:anchor="_Toc242442869" w:history="1">
+          <w:hyperlink w:anchor="_Toc242804638" w:history="1">
             <w:r>
               <w:rPr>
                 <w:rStyle w:val="Hipervnculo"/>
@@ -1411,7 +1411,7 @@
                 <w:noProof/>
                 <w:webHidden/>
               </w:rPr>
-              <w:instrText xml:space="preserve"> PAGEREF _Toc242442869 \h </w:instrText>
+              <w:instrText xml:space="preserve"> PAGEREF _Toc242804638 \h </w:instrText>
             </w:r>
             <w:r>
               <w:rPr>
@@ -1455,7 +1455,7 @@
               <w14:ligatures w14:val="standardContextual"/>
             </w:rPr>
           </w:pPr>
-          <w:hyperlink w:anchor="_Toc242442870" w:history="1">
+          <w:hyperlink w:anchor="_Toc242804639" w:history="1">
             <w:r>
               <w:rPr>
                 <w:rStyle w:val="Hipervnculo"/>
@@ -1482,7 +1482,7 @@
                 <w:noProof/>
                 <w:webHidden/>
               </w:rPr>
-              <w:instrText xml:space="preserve"> PAGEREF _Toc242442870 \h </w:instrText>
+              <w:instrText xml:space="preserve"> PAGEREF _Toc242804639 \h </w:instrText>
             </w:r>
             <w:r>
               <w:rPr>
@@ -1526,7 +1526,7 @@
               <w14:ligatures w14:val="standardContextual"/>
             </w:rPr>
           </w:pPr>
-          <w:hyperlink w:anchor="_Toc242442871" w:history="1">
+          <w:hyperlink w:anchor="_Toc242804640" w:history="1">
             <w:r>
               <w:rPr>
                 <w:rStyle w:val="Hipervnculo"/>
@@ -1553,7 +1553,7 @@
                 <w:noProof/>
                 <w:webHidden/>
               </w:rPr>
-              <w:instrText xml:space="preserve"> PAGEREF _Toc242442871 \h </w:instrText>
+              <w:instrText xml:space="preserve"> PAGEREF _Toc242804640 \h </w:instrText>
             </w:r>
             <w:r>
               <w:rPr>
@@ -1597,7 +1597,7 @@
               <w14:ligatures w14:val="standardContextual"/>
             </w:rPr>
           </w:pPr>
-          <w:hyperlink w:anchor="_Toc242442872" w:history="1">
+          <w:hyperlink w:anchor="_Toc242804641" w:history="1">
             <w:r>
               <w:rPr>
                 <w:rStyle w:val="Hipervnculo"/>
@@ -1624,7 +1624,7 @@
                 <w:noProof/>
                 <w:webHidden/>
               </w:rPr>
-              <w:instrText xml:space="preserve"> PAGEREF _Toc242442872 \h </w:instrText>
+              <w:instrText xml:space="preserve"> PAGEREF _Toc242804641 \h </w:instrText>
             </w:r>
             <w:r>
               <w:rPr>
@@ -1668,7 +1668,7 @@
               <w14:ligatures w14:val="standardContextual"/>
             </w:rPr>
           </w:pPr>
-          <w:hyperlink w:anchor="_Toc242442873" w:history="1">
+          <w:hyperlink w:anchor="_Toc242804642" w:history="1">
             <w:r>
               <w:rPr>
                 <w:rStyle w:val="Hipervnculo"/>
@@ -1695,7 +1695,7 @@
                 <w:noProof/>
                 <w:webHidden/>
               </w:rPr>
-              <w:instrText xml:space="preserve"> PAGEREF _Toc242442873 \h </w:instrText>
+              <w:instrText xml:space="preserve"> PAGEREF _Toc242804642 \h </w:instrText>
             </w:r>
             <w:r>
               <w:rPr>
@@ -1739,7 +1739,7 @@
               <w14:ligatures w14:val="standardContextual"/>
             </w:rPr>
           </w:pPr>
-          <w:hyperlink w:anchor="_Toc242442874" w:history="1">
+          <w:hyperlink w:anchor="_Toc242804643" w:history="1">
             <w:r>
               <w:rPr>
                 <w:rStyle w:val="Hipervnculo"/>
@@ -1766,7 +1766,7 @@
                 <w:noProof/>
                 <w:webHidden/>
               </w:rPr>
-              <w:instrText xml:space="preserve"> PAGEREF _Toc242442874 \h </w:instrText>
+              <w:instrText xml:space="preserve"> PAGEREF _Toc242804643 \h </w:instrText>
             </w:r>
             <w:r>
               <w:rPr>
@@ -1810,7 +1810,7 @@
               <w14:ligatures w14:val="standardContextual"/>
             </w:rPr>
           </w:pPr>
-          <w:hyperlink w:anchor="_Toc242442875" w:history="1">
+          <w:hyperlink w:anchor="_Toc242804644" w:history="1">
             <w:r>
               <w:rPr>
                 <w:rStyle w:val="Hipervnculo"/>
@@ -1837,7 +1837,7 @@
                 <w:noProof/>
                 <w:webHidden/>
               </w:rPr>
-              <w:instrText xml:space="preserve"> PAGEREF _Toc242442875 \h </w:instrText>
+              <w:instrText xml:space="preserve"> PAGEREF _Toc242804644 \h </w:instrText>
             </w:r>
             <w:r>
               <w:rPr>
@@ -1881,7 +1881,7 @@
               <w14:ligatures w14:val="standardContextual"/>
             </w:rPr>
           </w:pPr>
-          <w:hyperlink w:anchor="_Toc242442876" w:history="1">
+          <w:hyperlink w:anchor="_Toc242804645" w:history="1">
             <w:r>
               <w:rPr>
                 <w:rStyle w:val="Hipervnculo"/>
@@ -1908,7 +1908,7 @@
                 <w:noProof/>
                 <w:webHidden/>
               </w:rPr>
-              <w:instrText xml:space="preserve"> PAGEREF _Toc242442876 \h </w:instrText>
+              <w:instrText xml:space="preserve"> PAGEREF _Toc242804645 \h </w:instrText>
             </w:r>
             <w:r>
               <w:rPr>
@@ -1952,7 +1952,7 @@
               <w14:ligatures w14:val="standardContextual"/>
             </w:rPr>
           </w:pPr>
-          <w:hyperlink w:anchor="_Toc242442877" w:history="1">
+          <w:hyperlink w:anchor="_Toc242804646" w:history="1">
             <w:r>
               <w:rPr>
                 <w:rStyle w:val="Hipervnculo"/>
@@ -1979,7 +1979,7 @@
                 <w:noProof/>
                 <w:webHidden/>
               </w:rPr>
-              <w:instrText xml:space="preserve"> PAGEREF _Toc242442877 \h </w:instrText>
+              <w:instrText xml:space="preserve"> PAGEREF _Toc242804646 \h </w:instrText>
             </w:r>
             <w:r>
               <w:rPr>
@@ -2023,7 +2023,7 @@
               <w14:ligatures w14:val="standardContextual"/>
             </w:rPr>
           </w:pPr>
-          <w:hyperlink w:anchor="_Toc242442878" w:history="1">
+          <w:hyperlink w:anchor="_Toc242804647" w:history="1">
             <w:r>
               <w:rPr>
                 <w:rStyle w:val="Hipervnculo"/>
@@ -2050,7 +2050,7 @@
                 <w:noProof/>
                 <w:webHidden/>
               </w:rPr>
-              <w:instrText xml:space="preserve"> PAGEREF _Toc242442878 \h </w:instrText>
+              <w:instrText xml:space="preserve"> PAGEREF _Toc242804647 \h </w:instrText>
             </w:r>
             <w:r>
               <w:rPr>
@@ -2094,7 +2094,7 @@
               <w14:ligatures w14:val="standardContextual"/>
             </w:rPr>
           </w:pPr>
-          <w:hyperlink w:anchor="_Toc242442879" w:history="1">
+          <w:hyperlink w:anchor="_Toc242804648" w:history="1">
             <w:r>
               <w:rPr>
                 <w:rStyle w:val="Hipervnculo"/>
@@ -2121,7 +2121,7 @@
                 <w:noProof/>
                 <w:webHidden/>
               </w:rPr>
-              <w:instrText xml:space="preserve"> PAGEREF _Toc242442879 \h </w:instrText>
+              <w:instrText xml:space="preserve"> PAGEREF _Toc242804648 \h </w:instrText>
             </w:r>
             <w:r>
               <w:rPr>
@@ -2165,7 +2165,7 @@
               <w14:ligatures w14:val="standardContextual"/>
             </w:rPr>
           </w:pPr>
-          <w:hyperlink w:anchor="_Toc242442880" w:history="1">
+          <w:hyperlink w:anchor="_Toc242804649" w:history="1">
             <w:r>
               <w:rPr>
                 <w:rStyle w:val="Hipervnculo"/>
@@ -2193,7 +2193,7 @@
                 <w:noProof/>
                 <w:webHidden/>
               </w:rPr>
-              <w:instrText xml:space="preserve"> PAGEREF _Toc242442880 \h </w:instrText>
+              <w:instrText xml:space="preserve"> PAGEREF _Toc242804649 \h </w:instrText>
             </w:r>
             <w:r>
               <w:rPr>
@@ -2237,7 +2237,7 @@
               <w14:ligatures w14:val="standardContextual"/>
             </w:rPr>
           </w:pPr>
-          <w:hyperlink w:anchor="_Toc242442881" w:history="1">
+          <w:hyperlink w:anchor="_Toc242804650" w:history="1">
             <w:r>
               <w:rPr>
                 <w:rStyle w:val="Hipervnculo"/>
@@ -2265,7 +2265,7 @@
                 <w:noProof/>
                 <w:webHidden/>
               </w:rPr>
-              <w:instrText xml:space="preserve"> PAGEREF _Toc242442881 \h </w:instrText>
+              <w:instrText xml:space="preserve"> PAGEREF _Toc242804650 \h </w:instrText>
             </w:r>
             <w:r>
               <w:rPr>
@@ -2309,7 +2309,7 @@
               <w14:ligatures w14:val="standardContextual"/>
             </w:rPr>
           </w:pPr>
-          <w:hyperlink w:anchor="_Toc242442882" w:history="1">
+          <w:hyperlink w:anchor="_Toc242804651" w:history="1">
             <w:r>
               <w:rPr>
                 <w:rStyle w:val="Hipervnculo"/>
@@ -2336,7 +2336,7 @@
                 <w:noProof/>
                 <w:webHidden/>
               </w:rPr>
-              <w:instrText xml:space="preserve"> PAGEREF _Toc242442882 \h </w:instrText>
+              <w:instrText xml:space="preserve"> PAGEREF _Toc242804651 \h </w:instrText>
             </w:r>
             <w:r>
               <w:rPr>
@@ -2380,7 +2380,7 @@
               <w14:ligatures w14:val="standardContextual"/>
             </w:rPr>
           </w:pPr>
-          <w:hyperlink w:anchor="_Toc242442883" w:history="1">
+          <w:hyperlink w:anchor="_Toc242804652" w:history="1">
             <w:r>
               <w:rPr>
                 <w:rStyle w:val="Hipervnculo"/>
@@ -2407,7 +2407,7 @@
                 <w:noProof/>
                 <w:webHidden/>
               </w:rPr>
-              <w:instrText xml:space="preserve"> PAGEREF _Toc242442883 \h </w:instrText>
+              <w:instrText xml:space="preserve"> PAGEREF _Toc242804652 \h </w:instrText>
             </w:r>
             <w:r>
               <w:rPr>
@@ -2451,7 +2451,7 @@
               <w14:ligatures w14:val="standardContextual"/>
             </w:rPr>
           </w:pPr>
-          <w:hyperlink w:anchor="_Toc242442884" w:history="1">
+          <w:hyperlink w:anchor="_Toc242804653" w:history="1">
             <w:r>
               <w:rPr>
                 <w:rStyle w:val="Hipervnculo"/>
@@ -2478,7 +2478,7 @@
                 <w:noProof/>
                 <w:webHidden/>
               </w:rPr>
-              <w:instrText xml:space="preserve"> PAGEREF _Toc242442884 \h </w:instrText>
+              <w:instrText xml:space="preserve"> PAGEREF _Toc242804653 \h </w:instrText>
             </w:r>
             <w:r>
               <w:rPr>
@@ -2522,7 +2522,7 @@
               <w14:ligatures w14:val="standardContextual"/>
             </w:rPr>
           </w:pPr>
-          <w:hyperlink w:anchor="_Toc242442885" w:history="1">
+          <w:hyperlink w:anchor="_Toc242804654" w:history="1">
             <w:r>
               <w:rPr>
                 <w:rStyle w:val="Hipervnculo"/>
@@ -2549,7 +2549,7 @@
                 <w:noProof/>
                 <w:webHidden/>
               </w:rPr>
-              <w:instrText xml:space="preserve"> PAGEREF _Toc242442885 \h </w:instrText>
+              <w:instrText xml:space="preserve"> PAGEREF _Toc242804654 \h </w:instrText>
             </w:r>
             <w:r>
               <w:rPr>
@@ -2593,7 +2593,7 @@
               <w14:ligatures w14:val="standardContextual"/>
             </w:rPr>
           </w:pPr>
-          <w:hyperlink w:anchor="_Toc242442886" w:history="1">
+          <w:hyperlink w:anchor="_Toc242804655" w:history="1">
             <w:r>
               <w:rPr>
                 <w:rStyle w:val="Hipervnculo"/>
@@ -2621,7 +2621,7 @@
                 <w:noProof/>
                 <w:webHidden/>
               </w:rPr>
-              <w:instrText xml:space="preserve"> PAGEREF _Toc242442886 \h </w:instrText>
+              <w:instrText xml:space="preserve"> PAGEREF _Toc242804655 \h </w:instrText>
             </w:r>
             <w:r>
               <w:rPr>
@@ -2665,7 +2665,7 @@
               <w14:ligatures w14:val="standardContextual"/>
             </w:rPr>
           </w:pPr>
-          <w:hyperlink w:anchor="_Toc242442887" w:history="1">
+          <w:hyperlink w:anchor="_Toc242804656" w:history="1">
             <w:r>
               <w:rPr>
                 <w:rStyle w:val="Hipervnculo"/>
@@ -2693,7 +2693,7 @@
                 <w:noProof/>
                 <w:webHidden/>
               </w:rPr>
-              <w:instrText xml:space="preserve"> PAGEREF _Toc242442887 \h </w:instrText>
+              <w:instrText xml:space="preserve"> PAGEREF _Toc242804656 \h </w:instrText>
             </w:r>
             <w:r>
               <w:rPr>
@@ -2737,7 +2737,7 @@
               <w14:ligatures w14:val="standardContextual"/>
             </w:rPr>
           </w:pPr>
-          <w:hyperlink w:anchor="_Toc242442888" w:history="1">
+          <w:hyperlink w:anchor="_Toc242804657" w:history="1">
             <w:r>
               <w:rPr>
                 <w:rStyle w:val="Hipervnculo"/>
@@ -2765,7 +2765,7 @@
                 <w:noProof/>
                 <w:webHidden/>
               </w:rPr>
-              <w:instrText xml:space="preserve"> PAGEREF _Toc242442888 \h </w:instrText>
+              <w:instrText xml:space="preserve"> PAGEREF _Toc242804657 \h </w:instrText>
             </w:r>
             <w:r>
               <w:rPr>
@@ -2809,7 +2809,7 @@
               <w14:ligatures w14:val="standardContextual"/>
             </w:rPr>
           </w:pPr>
-          <w:hyperlink w:anchor="_Toc242442889" w:history="1">
+          <w:hyperlink w:anchor="_Toc242804658" w:history="1">
             <w:r>
               <w:rPr>
                 <w:rStyle w:val="Hipervnculo"/>
@@ -2836,7 +2836,7 @@
                 <w:noProof/>
                 <w:webHidden/>
               </w:rPr>
-              <w:instrText xml:space="preserve"> PAGEREF _Toc242442889 \h </w:instrText>
+              <w:instrText xml:space="preserve"> PAGEREF _Toc242804658 \h </w:instrText>
             </w:r>
             <w:r>
               <w:rPr>
@@ -2880,7 +2880,7 @@
               <w14:ligatures w14:val="standardContextual"/>
             </w:rPr>
           </w:pPr>
-          <w:hyperlink w:anchor="_Toc242442890" w:history="1">
+          <w:hyperlink w:anchor="_Toc242804659" w:history="1">
             <w:r>
               <w:rPr>
                 <w:rStyle w:val="Hipervnculo"/>
@@ -2907,7 +2907,7 @@
                 <w:noProof/>
                 <w:webHidden/>
               </w:rPr>
-              <w:instrText xml:space="preserve"> PAGEREF _Toc242442890 \h </w:instrText>
+              <w:instrText xml:space="preserve"> PAGEREF _Toc242804659 \h </w:instrText>
             </w:r>
             <w:r>
               <w:rPr>
@@ -2951,7 +2951,7 @@
               <w14:ligatures w14:val="standardContextual"/>
             </w:rPr>
           </w:pPr>
-          <w:hyperlink w:anchor="_Toc242442891" w:history="1">
+          <w:hyperlink w:anchor="_Toc242804660" w:history="1">
             <w:r>
               <w:rPr>
                 <w:rStyle w:val="Hipervnculo"/>
@@ -2978,7 +2978,7 @@
                 <w:noProof/>
                 <w:webHidden/>
               </w:rPr>
-              <w:instrText xml:space="preserve"> PAGEREF _Toc242442891 \h </w:instrText>
+              <w:instrText xml:space="preserve"> PAGEREF _Toc242804660 \h </w:instrText>
             </w:r>
             <w:r>
               <w:rPr>
@@ -3022,7 +3022,7 @@
               <w14:ligatures w14:val="standardContextual"/>
             </w:rPr>
           </w:pPr>
-          <w:hyperlink w:anchor="_Toc242442892" w:history="1">
+          <w:hyperlink w:anchor="_Toc242804661" w:history="1">
             <w:r>
               <w:rPr>
                 <w:rStyle w:val="Hipervnculo"/>
@@ -3049,7 +3049,7 @@
                 <w:noProof/>
                 <w:webHidden/>
               </w:rPr>
-              <w:instrText xml:space="preserve"> PAGEREF _Toc242442892 \h </w:instrText>
+              <w:instrText xml:space="preserve"> PAGEREF _Toc242804661 \h </w:instrText>
             </w:r>
             <w:r>
               <w:rPr>
@@ -3093,7 +3093,7 @@
               <w14:ligatures w14:val="standardContextual"/>
             </w:rPr>
           </w:pPr>
-          <w:hyperlink w:anchor="_Toc242442893" w:history="1">
+          <w:hyperlink w:anchor="_Toc242804662" w:history="1">
             <w:r>
               <w:rPr>
                 <w:rStyle w:val="Hipervnculo"/>
@@ -3120,7 +3120,7 @@
                 <w:noProof/>
                 <w:webHidden/>
               </w:rPr>
-              <w:instrText xml:space="preserve"> PAGEREF _Toc242442893 \h </w:instrText>
+              <w:instrText xml:space="preserve"> PAGEREF _Toc242804662 \h </w:instrText>
             </w:r>
             <w:r>
               <w:rPr>
@@ -3164,7 +3164,7 @@
               <w14:ligatures w14:val="standardContextual"/>
             </w:rPr>
           </w:pPr>
-          <w:hyperlink w:anchor="_Toc242442894" w:history="1">
+          <w:hyperlink w:anchor="_Toc242804663" w:history="1">
             <w:r>
               <w:rPr>
                 <w:rStyle w:val="Hipervnculo"/>
@@ -3191,7 +3191,7 @@
                 <w:noProof/>
                 <w:webHidden/>
               </w:rPr>
-              <w:instrText xml:space="preserve"> PAGEREF _Toc242442894 \h </w:instrText>
+              <w:instrText xml:space="preserve"> PAGEREF _Toc242804663 \h </w:instrText>
             </w:r>
             <w:r>
               <w:rPr>
@@ -3235,7 +3235,7 @@
               <w14:ligatures w14:val="standardContextual"/>
             </w:rPr>
           </w:pPr>
-          <w:hyperlink w:anchor="_Toc242442895" w:history="1">
+          <w:hyperlink w:anchor="_Toc242804664" w:history="1">
             <w:r>
               <w:rPr>
                 <w:rStyle w:val="Hipervnculo"/>
@@ -3262,7 +3262,7 @@
                 <w:noProof/>
                 <w:webHidden/>
               </w:rPr>
-              <w:instrText xml:space="preserve"> PAGEREF _Toc242442895 \h </w:instrText>
+              <w:instrText xml:space="preserve"> PAGEREF _Toc242804664 \h </w:instrText>
             </w:r>
             <w:r>
               <w:rPr>
@@ -3306,7 +3306,7 @@
               <w14:ligatures w14:val="standardContextual"/>
             </w:rPr>
           </w:pPr>
-          <w:hyperlink w:anchor="_Toc242442896" w:history="1">
+          <w:hyperlink w:anchor="_Toc242804665" w:history="1">
             <w:r>
               <w:rPr>
                 <w:rStyle w:val="Hipervnculo"/>
@@ -3333,7 +3333,7 @@
                 <w:noProof/>
                 <w:webHidden/>
               </w:rPr>
-              <w:instrText xml:space="preserve"> PAGEREF _Toc242442896 \h </w:instrText>
+              <w:instrText xml:space="preserve"> PAGEREF _Toc242804665 \h </w:instrText>
             </w:r>
             <w:r>
               <w:rPr>
@@ -3377,7 +3377,7 @@
               <w14:ligatures w14:val="standardContextual"/>
             </w:rPr>
           </w:pPr>
-          <w:hyperlink w:anchor="_Toc242442897" w:history="1">
+          <w:hyperlink w:anchor="_Toc242804666" w:history="1">
             <w:r>
               <w:rPr>
                 <w:rStyle w:val="Hipervnculo"/>
@@ -3404,7 +3404,7 @@
                 <w:noProof/>
                 <w:webHidden/>
               </w:rPr>
-              <w:instrText xml:space="preserve"> PAGEREF _Toc242442897 \h </w:instrText>
+              <w:instrText xml:space="preserve"> PAGEREF _Toc242804666 \h </w:instrText>
             </w:r>
             <w:r>
               <w:rPr>
@@ -3446,7 +3446,7 @@
       <w:pPr>
         <w:pStyle w:val="Ttulo1"/>
       </w:pPr>
-      <w:bookmarkStart w:id="0" w:name="_Toc242442850"/>
+      <w:bookmarkStart w:id="0" w:name="_Toc242804619"/>
       <w:r>
         <w:t>1. GUIA DE DESARROLLO</w:t>
       </w:r>
@@ -3460,7 +3460,7 @@
           <w:bCs w:val="0"/>
         </w:rPr>
       </w:pPr>
-      <w:bookmarkStart w:id="1" w:name="_Toc242442851"/>
+      <w:bookmarkStart w:id="1" w:name="_Toc242804620"/>
       <w:r>
         <w:t>1.1 FICHA GENERAL DEL VIDEOJUEGO</w:t>
       </w:r>
@@ -4169,7 +4169,7 @@
           <w:bCs w:val="0"/>
         </w:rPr>
       </w:pPr>
-      <w:bookmarkStart w:id="2" w:name="_Toc242442852"/>
+      <w:bookmarkStart w:id="2" w:name="_Toc242804621"/>
       <w:r>
         <w:t>1.1.1 Personajes</w:t>
       </w:r>
@@ -4880,7 +4880,7 @@
           <w:bCs w:val="0"/>
         </w:rPr>
       </w:pPr>
-      <w:bookmarkStart w:id="3" w:name="_Toc242442853"/>
+      <w:bookmarkStart w:id="3" w:name="_Toc242804622"/>
       <w:r>
         <w:t>1.1.2 Estructura de niveles</w:t>
       </w:r>
@@ -5635,7 +5635,7 @@
           <w:bCs w:val="0"/>
         </w:rPr>
       </w:pPr>
-      <w:bookmarkStart w:id="4" w:name="_Toc242442854"/>
+      <w:bookmarkStart w:id="4" w:name="_Toc242804623"/>
       <w:r>
         <w:t>1.2. CONVENCIONES DEL DOCUMENTO</w:t>
       </w:r>
@@ -5731,7 +5731,7 @@
           <w:lang w:val="en-US"/>
         </w:rPr>
       </w:pPr>
-      <w:bookmarkStart w:id="5" w:name="_Toc242442855"/>
+      <w:bookmarkStart w:id="5" w:name="_Toc242804624"/>
       <w:r>
         <w:rPr>
           <w:sz w:val="24"/>
@@ -6344,7 +6344,7 @@
       <w:pPr>
         <w:pStyle w:val="Ttulo2"/>
       </w:pPr>
-      <w:bookmarkStart w:id="6" w:name="_Toc242442856"/>
+      <w:bookmarkStart w:id="6" w:name="_Toc242804625"/>
       <w:r>
         <w:t>1.3. PRÓLOGO Y ESTRUCTURA NARRATIVA</w:t>
       </w:r>
@@ -6390,7 +6390,7 @@
           <w:lang w:val="es-CO"/>
         </w:rPr>
       </w:pPr>
-      <w:bookmarkStart w:id="7" w:name="_Toc242442857"/>
+      <w:bookmarkStart w:id="7" w:name="_Toc242804626"/>
       <w:r>
         <w:rPr>
           <w:lang w:val="es-CO"/>
@@ -6417,7 +6417,27 @@
           <w:sz w:val="22"/>
           <w:szCs w:val="22"/>
         </w:rPr>
-        <w:t>Noche helada, sin luna. La familia camina a la intemperie. Se escuchan animales y sonidos extraños. En el horizonte se distingue la silueta de una cueva.</w:t>
+        <w:t>Noche helada, sin luna. La familia camina a</w:t>
+      </w:r>
+      <w:r>
+        <w:rPr>
+          <w:i/>
+          <w:iCs/>
+          <w:color w:val="000000"/>
+          <w:sz w:val="22"/>
+          <w:szCs w:val="22"/>
+        </w:rPr>
+        <w:t>l aire libre, sin techo. Se escuchan animales y sonidos extraños. En el horizonte se distingue la sombr</w:t>
+      </w:r>
+      <w:r>
+        <w:rPr>
+          <w:i/>
+          <w:iCs/>
+          <w:color w:val="000000"/>
+          <w:sz w:val="22"/>
+          <w:szCs w:val="22"/>
+        </w:rPr>
+        <w:t>a de una cueva.</w:t>
       </w:r>
     </w:p>
     <w:p>
@@ -6438,7 +6458,27 @@
           <w:sz w:val="22"/>
           <w:szCs w:val="22"/>
         </w:rPr>
-        <w:t>Algo se acerca entre la maleza. La familia corre hacia la cueva y entra.</w:t>
+        <w:t>Algo se acerca entre l</w:t>
+      </w:r>
+      <w:r>
+        <w:rPr>
+          <w:i/>
+          <w:iCs/>
+          <w:color w:val="000000"/>
+          <w:sz w:val="22"/>
+          <w:szCs w:val="22"/>
+        </w:rPr>
+        <w:t>os matorrales</w:t>
+      </w:r>
+      <w:r>
+        <w:rPr>
+          <w:i/>
+          <w:iCs/>
+          <w:color w:val="000000"/>
+          <w:sz w:val="22"/>
+          <w:szCs w:val="22"/>
+        </w:rPr>
+        <w:t>. La familia corre hacia la cueva y entra.</w:t>
       </w:r>
     </w:p>
     <w:p>
@@ -6494,7 +6534,7 @@
       <w:pPr>
         <w:pStyle w:val="Ttulo2"/>
       </w:pPr>
-      <w:bookmarkStart w:id="8" w:name="_Toc242442858"/>
+      <w:bookmarkStart w:id="8" w:name="_Toc242804627"/>
       <w:r>
         <w:t>1.4. NIVEL 1 — LA OSCURIDAD</w:t>
       </w:r>
@@ -7056,7 +7096,7 @@
           <w:lang w:val="es-CO"/>
         </w:rPr>
       </w:pPr>
-      <w:bookmarkStart w:id="9" w:name="_Toc242442859"/>
+      <w:bookmarkStart w:id="9" w:name="_Toc242804628"/>
       <w:r>
         <w:rPr>
           <w:lang w:val="es-CO"/>
@@ -7140,7 +7180,27 @@
           <w:szCs w:val="22"/>
         </w:rPr>
         <w:lastRenderedPageBreak/>
-        <w:t>Algoritm gira en el aire como un trompo feliz, dejando una estela de puntos luminosos, y avanza despacio hacia el fondo de la cueva, mirando atrás para asegurarse de que la familia lo sigue.</w:t>
+        <w:t>Algoritm gira en el aire como un trompo feliz, dejando un</w:t>
+      </w:r>
+      <w:r>
+        <w:rPr>
+          <w:i/>
+          <w:iCs/>
+          <w:color w:val="000000" w:themeColor="text1"/>
+          <w:sz w:val="22"/>
+          <w:szCs w:val="22"/>
+        </w:rPr>
+        <w:t xml:space="preserve"> rastro</w:t>
+      </w:r>
+      <w:r>
+        <w:rPr>
+          <w:i/>
+          <w:iCs/>
+          <w:color w:val="000000" w:themeColor="text1"/>
+          <w:sz w:val="22"/>
+          <w:szCs w:val="22"/>
+        </w:rPr>
+        <w:t xml:space="preserve"> de puntos luminosos, y avanza despacio hacia el fondo de la cueva, mirando atrás para asegurarse de que la familia lo sigue.</w:t>
       </w:r>
     </w:p>
     <w:p>
@@ -7187,7 +7247,7 @@
           <w:lang w:val="es-CO"/>
         </w:rPr>
       </w:pPr>
-      <w:bookmarkStart w:id="10" w:name="_Toc242442860"/>
+      <w:bookmarkStart w:id="10" w:name="_Toc242804629"/>
       <w:r>
         <w:rPr>
           <w:lang w:val="es-CO"/>
@@ -7417,7 +7477,27 @@
           <w:sz w:val="22"/>
           <w:szCs w:val="22"/>
         </w:rPr>
-        <w:t>Papá se arrodilla en el centro de la cueva, busca a tientas un montón de hojas secas y ramitas finas, y las amontona con cuidado en el suelo.</w:t>
+        <w:t xml:space="preserve">Papá se arrodilla en el centro de la cueva, busca a </w:t>
+      </w:r>
+      <w:r>
+        <w:rPr>
+          <w:i/>
+          <w:iCs/>
+          <w:color w:val="000000"/>
+          <w:sz w:val="22"/>
+          <w:szCs w:val="22"/>
+        </w:rPr>
+        <w:t>cieg</w:t>
+      </w:r>
+      <w:r>
+        <w:rPr>
+          <w:i/>
+          <w:iCs/>
+          <w:color w:val="000000"/>
+          <w:sz w:val="22"/>
+          <w:szCs w:val="22"/>
+        </w:rPr>
+        <w:t>as un montón de hojas secas y ramitas finas, y las amontona con cuidado en el suelo.</w:t>
       </w:r>
     </w:p>
     <w:p>
@@ -7450,7 +7530,7 @@
           <w:lang w:val="es-CO"/>
         </w:rPr>
       </w:pPr>
-      <w:bookmarkStart w:id="11" w:name="_Toc242442861"/>
+      <w:bookmarkStart w:id="11" w:name="_Toc242804630"/>
       <w:r>
         <w:rPr>
           <w:lang w:val="es-CO"/>
@@ -13446,7 +13526,7 @@
           <w:lang w:val="es-CO"/>
         </w:rPr>
       </w:pPr>
-      <w:bookmarkStart w:id="12" w:name="_Toc242442862"/>
+      <w:bookmarkStart w:id="12" w:name="_Toc242804631"/>
       <w:r>
         <w:rPr>
           <w:lang w:val="es-CO"/>
@@ -13529,7 +13609,27 @@
           <w:sz w:val="22"/>
           <w:szCs w:val="22"/>
         </w:rPr>
-        <w:t>Los niños salen corriendo y se lanzan encima de él. Mamá llega detrás, riendo y llorando al mismo tiempo. Papá los abraza a todos mientras el fuego crepita y la cueva oscura se convierte en el lugar más cálido del mundo.</w:t>
+        <w:t>Los niños salen corriendo y se lanzan encima de él. Mamá llega detrás, riendo y llorando al mismo tiempo. Papá los abraza a todos mientras el fuego c</w:t>
+      </w:r>
+      <w:r>
+        <w:rPr>
+          <w:i/>
+          <w:iCs/>
+          <w:color w:val="000000"/>
+          <w:sz w:val="22"/>
+          <w:szCs w:val="22"/>
+        </w:rPr>
+        <w:t>hisporrote</w:t>
+      </w:r>
+      <w:r>
+        <w:rPr>
+          <w:i/>
+          <w:iCs/>
+          <w:color w:val="000000"/>
+          <w:sz w:val="22"/>
+          <w:szCs w:val="22"/>
+        </w:rPr>
+        <w:t>a y la cueva oscura se convierte en el lugar más cálido del mundo.</w:t>
       </w:r>
     </w:p>
     <w:p>
@@ -13564,7 +13664,27 @@
           <w:sz w:val="22"/>
           <w:szCs w:val="22"/>
         </w:rPr>
-        <w:t>En el corazón de las llamas aparece una silueta pequeña, con cara, brazos y piernas. Es Algoritm, brillando más que nunca, hecho de fuego esta vez.</w:t>
+        <w:t>En el corazón de las llamas aparece una s</w:t>
+      </w:r>
+      <w:r>
+        <w:rPr>
+          <w:i/>
+          <w:iCs/>
+          <w:color w:val="000000" w:themeColor="text1"/>
+          <w:sz w:val="22"/>
+          <w:szCs w:val="22"/>
+        </w:rPr>
+        <w:t>ombr</w:t>
+      </w:r>
+      <w:r>
+        <w:rPr>
+          <w:i/>
+          <w:iCs/>
+          <w:color w:val="000000" w:themeColor="text1"/>
+          <w:sz w:val="22"/>
+          <w:szCs w:val="22"/>
+        </w:rPr>
+        <w:t>a pequeña, con cara, brazos y piernas. Es Algoritm, brillando más que nunca, hecho de fuego esta vez.</w:t>
       </w:r>
     </w:p>
     <w:p>
@@ -13683,7 +13803,7 @@
       <w:pPr>
         <w:pStyle w:val="Ttulo2"/>
       </w:pPr>
-      <w:bookmarkStart w:id="13" w:name="_Toc242442863"/>
+      <w:bookmarkStart w:id="13" w:name="_Toc242804632"/>
       <w:r>
         <w:lastRenderedPageBreak/>
         <w:t>1.5. ESCENA PUENTE I — DEL FUEGO AL ALIMENTO</w:t>
@@ -13800,7 +13920,27 @@
           <w:sz w:val="22"/>
           <w:szCs w:val="22"/>
         </w:rPr>
-        <w:t>La familia sale a recolectar. Papá carga grandes troncos para mantener avivado el fuego; mamá, la niña y el niño recogen alimentos. Al momento de regresar aparece un problema nuevo: han recolectado mucho, pero no pueden transportarlo hasta el refugio.</w:t>
+        <w:t xml:space="preserve">La familia sale a recolectar. Papá carga grandes troncos para mantener </w:t>
+      </w:r>
+      <w:r>
+        <w:rPr>
+          <w:i/>
+          <w:iCs/>
+          <w:color w:val="000000"/>
+          <w:sz w:val="22"/>
+          <w:szCs w:val="22"/>
+        </w:rPr>
+        <w:t>viv</w:t>
+      </w:r>
+      <w:r>
+        <w:rPr>
+          <w:i/>
+          <w:iCs/>
+          <w:color w:val="000000"/>
+          <w:sz w:val="22"/>
+          <w:szCs w:val="22"/>
+        </w:rPr>
+        <w:t>o el fuego; mamá, la niña y el niño recogen alimentos. Al momento de regresar aparece un problema nuevo: han recolectado mucho, pero no pueden transportarlo hasta el refugio.</w:t>
       </w:r>
     </w:p>
     <w:p>
@@ -13896,7 +14036,7 @@
       <w:pPr>
         <w:pStyle w:val="Ttulo2"/>
       </w:pPr>
-      <w:bookmarkStart w:id="14" w:name="_Toc242442864"/>
+      <w:bookmarkStart w:id="14" w:name="_Toc242804633"/>
       <w:r>
         <w:t>1.6. NIVEL 2 — LA RUEDA</w:t>
       </w:r>
@@ -14542,7 +14682,7 @@
           <w:lang w:val="es-CO"/>
         </w:rPr>
       </w:pPr>
-      <w:bookmarkStart w:id="15" w:name="_Toc242442865"/>
+      <w:bookmarkStart w:id="15" w:name="_Toc242804634"/>
       <w:r>
         <w:rPr>
           <w:lang w:val="es-CO"/>
@@ -14587,7 +14727,27 @@
           <w:sz w:val="22"/>
           <w:szCs w:val="22"/>
         </w:rPr>
-        <w:t>Bosque, por la tarde. Objetos dispersos por el suelo: piedras irregulares, troncos redondos, plantas, herramientas. A un lado, la caja de alimentos que la familia no logra mover.</w:t>
+        <w:t xml:space="preserve">Bosque, por la tarde. Objetos </w:t>
+      </w:r>
+      <w:r>
+        <w:rPr>
+          <w:i/>
+          <w:iCs/>
+          <w:color w:val="000000"/>
+          <w:sz w:val="22"/>
+          <w:szCs w:val="22"/>
+        </w:rPr>
+        <w:t>regados por el suelo: piedras de formas distinta</w:t>
+      </w:r>
+      <w:r>
+        <w:rPr>
+          <w:i/>
+          <w:iCs/>
+          <w:color w:val="000000"/>
+          <w:sz w:val="22"/>
+          <w:szCs w:val="22"/>
+        </w:rPr>
+        <w:t>s, troncos redondos, plantas, herramientas. A un lado, la caja de alimentos que la familia no logra mover.</w:t>
       </w:r>
     </w:p>
     <w:p>
@@ -15786,7 +15946,7 @@
           <w:lang w:val="es-CO"/>
         </w:rPr>
       </w:pPr>
-      <w:bookmarkStart w:id="16" w:name="_Toc242442866"/>
+      <w:bookmarkStart w:id="16" w:name="_Toc242804635"/>
       <w:r>
         <w:rPr>
           <w:lang w:val="es-CO"/>
@@ -17572,7 +17732,7 @@
           <w:lang w:val="es-CO"/>
         </w:rPr>
       </w:pPr>
-      <w:bookmarkStart w:id="17" w:name="_Toc242442867"/>
+      <w:bookmarkStart w:id="17" w:name="_Toc242804636"/>
       <w:r>
         <w:rPr>
           <w:lang w:val="es-CO"/>
@@ -18595,7 +18755,7 @@
           <w:lang w:val="es-CO"/>
         </w:rPr>
       </w:pPr>
-      <w:bookmarkStart w:id="18" w:name="_Toc242442868"/>
+      <w:bookmarkStart w:id="18" w:name="_Toc242804637"/>
       <w:r>
         <w:rPr>
           <w:lang w:val="es-CO"/>
@@ -18664,7 +18824,7 @@
       <w:pPr>
         <w:pStyle w:val="Ttulo2"/>
       </w:pPr>
-      <w:bookmarkStart w:id="19" w:name="_Toc242442869"/>
+      <w:bookmarkStart w:id="19" w:name="_Toc242804638"/>
       <w:r>
         <w:t>1.7. ESCENA PUENTE II — DEL REFUGIO AL RÍO</w:t>
       </w:r>
@@ -18766,7 +18926,27 @@
           <w:sz w:val="22"/>
           <w:szCs w:val="22"/>
         </w:rPr>
-        <w:t>La cámara se desplaza hacia el horizonte. A lo lejos se ven las fogatas de la civilización.</w:t>
+        <w:t xml:space="preserve">La cámara se desplaza hacia el horizonte. A lo lejos se ven las fogatas de </w:t>
+      </w:r>
+      <w:r>
+        <w:rPr>
+          <w:i/>
+          <w:iCs/>
+          <w:color w:val="000000"/>
+          <w:sz w:val="22"/>
+          <w:szCs w:val="22"/>
+        </w:rPr>
+        <w:t>otras familias</w:t>
+      </w:r>
+      <w:r>
+        <w:rPr>
+          <w:i/>
+          <w:iCs/>
+          <w:color w:val="000000"/>
+          <w:sz w:val="22"/>
+          <w:szCs w:val="22"/>
+        </w:rPr>
+        <w:t>.</w:t>
       </w:r>
     </w:p>
     <w:p>
@@ -18843,7 +19023,27 @@
           <w:sz w:val="22"/>
           <w:szCs w:val="22"/>
         </w:rPr>
-        <w:t>La familia avanza con la carretilla. El camino se corta abruptamente. Frente a ellos: el río, ancho y de corriente visible.</w:t>
+        <w:t xml:space="preserve">La familia avanza con la carretilla. El camino se corta </w:t>
+      </w:r>
+      <w:r>
+        <w:rPr>
+          <w:i/>
+          <w:iCs/>
+          <w:color w:val="000000"/>
+          <w:sz w:val="22"/>
+          <w:szCs w:val="22"/>
+        </w:rPr>
+        <w:t>de rep</w:t>
+      </w:r>
+      <w:r>
+        <w:rPr>
+          <w:i/>
+          <w:iCs/>
+          <w:color w:val="000000"/>
+          <w:sz w:val="22"/>
+          <w:szCs w:val="22"/>
+        </w:rPr>
+        <w:t>ente. Frente a ellos: el río, ancho y de corriente visible.</w:t>
       </w:r>
     </w:p>
     <w:p>
@@ -18908,7 +19108,7 @@
       <w:pPr>
         <w:pStyle w:val="Ttulo2"/>
       </w:pPr>
-      <w:bookmarkStart w:id="20" w:name="_Toc242442870"/>
+      <w:bookmarkStart w:id="20" w:name="_Toc242804639"/>
       <w:r>
         <w:t>1.8. NIVEL 3 — EL RÍO</w:t>
       </w:r>
@@ -19468,7 +19668,7 @@
           <w:lang w:val="es-CO"/>
         </w:rPr>
       </w:pPr>
-      <w:bookmarkStart w:id="21" w:name="_Toc242442871"/>
+      <w:bookmarkStart w:id="21" w:name="_Toc242804640"/>
       <w:r>
         <w:rPr>
           <w:lang w:val="es-CO"/>
@@ -19488,7 +19688,19 @@
         <w:rPr>
           <w:color w:val="000000" w:themeColor="text1"/>
         </w:rPr>
-        <w:t>ALGORITM: ¡Alto, viajeros! Este río no es sencillo. Para cruzarlo necesitamos pensar bien. Primero, descompongamos el problema: ¿cuántas cosas necesitamos para cruzar?</w:t>
+        <w:t xml:space="preserve">ALGORITM: ¡Alto, viajeros! Este río no es </w:t>
+      </w:r>
+      <w:r>
+        <w:rPr>
+          <w:color w:val="000000" w:themeColor="text1"/>
+        </w:rPr>
+        <w:t>fácil</w:t>
+      </w:r>
+      <w:r>
+        <w:rPr>
+          <w:color w:val="000000" w:themeColor="text1"/>
+        </w:rPr>
+        <w:t>. Para cruzarlo necesitamos pensar bien. Primero, descompongamos el problema: ¿cuántas cosas necesitamos para cruzar?</w:t>
       </w:r>
     </w:p>
     <w:p>
@@ -19537,7 +19749,27 @@
           <w:sz w:val="22"/>
           <w:szCs w:val="22"/>
         </w:rPr>
-        <w:t>En pantalla aparece la lista de tareas, que permanecerá visible durante todo el nivel.</w:t>
+        <w:t xml:space="preserve">En pantalla aparece la lista de tareas, que </w:t>
+      </w:r>
+      <w:r>
+        <w:rPr>
+          <w:i/>
+          <w:iCs/>
+          <w:color w:val="000000"/>
+          <w:sz w:val="22"/>
+          <w:szCs w:val="22"/>
+        </w:rPr>
+        <w:t>se queda a la vista</w:t>
+      </w:r>
+      <w:r>
+        <w:rPr>
+          <w:i/>
+          <w:iCs/>
+          <w:color w:val="000000"/>
+          <w:sz w:val="22"/>
+          <w:szCs w:val="22"/>
+        </w:rPr>
+        <w:t xml:space="preserve"> durante todo el nivel.</w:t>
       </w:r>
     </w:p>
     <w:tbl>
@@ -19812,7 +20044,15 @@
                 <w:szCs w:val="20"/>
                 <w:lang w:val="en-US"/>
               </w:rPr>
-              <w:t>Ensamblar la balsa</w:t>
+              <w:t>Arm</w:t>
+            </w:r>
+            <w:r>
+              <w:rPr>
+                <w:sz w:val="20"/>
+                <w:szCs w:val="20"/>
+                <w:lang w:val="en-US"/>
+              </w:rPr>
+              <w:t>ar la balsa</w:t>
             </w:r>
           </w:p>
         </w:tc>
@@ -19895,7 +20135,7 @@
           <w:lang w:val="es-CO"/>
         </w:rPr>
       </w:pPr>
-      <w:bookmarkStart w:id="22" w:name="_Toc242442872"/>
+      <w:bookmarkStart w:id="22" w:name="_Toc242804641"/>
       <w:r>
         <w:rPr>
           <w:lang w:val="es-CO"/>
@@ -20369,7 +20609,21 @@
                 <w:sz w:val="20"/>
                 <w:szCs w:val="20"/>
               </w:rPr>
-              <w:t xml:space="preserve">Cada tarea se marca como completada en el momento en que se cumple: las de recolección, cuando su material queda completo en el inventario —los troncos, al recoger el último; las sogas, al recogerlas—; las de construcción, al confirmar la fase correspondiente del panel de ensamblaje: «Ensamblar la balsa», al confirmar el amarre, y «Colocar el mástil y la vela», al confirmar la fase de mástil y vela; confirmar la base no marca ninguna. La tela y el mástil se recogen sin marcar tarea, porque los consume la tarea 4. Una tarea marcada no se desmarca. La lista ocupa una tablilla clara en la esquina superior izquierda: cada tarea pendiente lleva un círculo liso y cada tarea cumplida un círculo verde con marca de verificación, de modo que el cambio se lee por la forma y no solo por el color (RNF-19), y en ella no aparece ninguna cifra. </w:t>
+              <w:t>Cada tarea se marca como completada en el momento en que se cumple: las de recolección, cuando su material queda completo en el inventario —los troncos, al recoger el último; las sogas, al recogerlas—; las de construcción, al confirmar la fase correspondiente del panel de ensamblaje: «</w:t>
+            </w:r>
+            <w:r>
+              <w:rPr>
+                <w:sz w:val="20"/>
+                <w:szCs w:val="20"/>
+              </w:rPr>
+              <w:t>Arm</w:t>
+            </w:r>
+            <w:r>
+              <w:rPr>
+                <w:sz w:val="20"/>
+                <w:szCs w:val="20"/>
+              </w:rPr>
+              <w:t xml:space="preserve">ar la balsa», al confirmar el amarre, y «Colocar el mástil y la vela», al confirmar la fase de mástil y vela; confirmar la base no marca ninguna. La tela y el mástil se recogen sin marcar tarea, porque los consume la tarea 4. Una tarea marcada no se desmarca. La lista ocupa una tablilla clara en la esquina superior izquierda: cada tarea pendiente lleva un círculo liso y cada tarea cumplida un círculo verde con marca de verificación, de modo que el cambio se lee por la forma y no solo por el color (RNF-19), y en ella no aparece ninguna cifra. </w:t>
             </w:r>
             <w:r>
               <w:rPr>
@@ -20481,7 +20735,7 @@
           <w:bCs w:val="0"/>
         </w:rPr>
       </w:pPr>
-      <w:bookmarkStart w:id="23" w:name="_Toc242442873"/>
+      <w:bookmarkStart w:id="23" w:name="_Toc242804642"/>
       <w:r>
         <w:t>1.8.3 Mecánica del ensamblaje por fases</w:t>
       </w:r>
@@ -21120,7 +21374,7 @@
           <w:bCs w:val="0"/>
         </w:rPr>
       </w:pPr>
-      <w:bookmarkStart w:id="24" w:name="_Toc242442874"/>
+      <w:bookmarkStart w:id="24" w:name="_Toc242804643"/>
       <w:r>
         <w:t>1.8.4 Mecánica de prueba y depuración</w:t>
       </w:r>
@@ -22003,7 +22257,27 @@
           <w:sz w:val="22"/>
           <w:szCs w:val="22"/>
         </w:rPr>
-        <w:t>La familia sube a la balsa corregida. Esta vez flota con estabilidad. La vela se llena de viento.</w:t>
+        <w:t xml:space="preserve">La familia sube a la balsa corregida. Esta vez flota </w:t>
+      </w:r>
+      <w:r>
+        <w:rPr>
+          <w:i/>
+          <w:iCs/>
+          <w:color w:val="000000"/>
+          <w:sz w:val="22"/>
+          <w:szCs w:val="22"/>
+        </w:rPr>
+        <w:t>derecha, sin voltearse</w:t>
+      </w:r>
+      <w:r>
+        <w:rPr>
+          <w:i/>
+          <w:iCs/>
+          <w:color w:val="000000"/>
+          <w:sz w:val="22"/>
+          <w:szCs w:val="22"/>
+        </w:rPr>
+        <w:t>. La vela se llena de viento.</w:t>
       </w:r>
     </w:p>
     <w:p>
@@ -22052,7 +22326,27 @@
           <w:sz w:val="22"/>
           <w:szCs w:val="22"/>
         </w:rPr>
-        <w:t>Llegan a la orilla opuesta. El humo de las fogatas de la civilización se divisa cerca, en el horizonte.</w:t>
+        <w:t>Llegan a la o</w:t>
+      </w:r>
+      <w:r>
+        <w:rPr>
+          <w:i/>
+          <w:iCs/>
+          <w:color w:val="000000"/>
+          <w:sz w:val="22"/>
+          <w:szCs w:val="22"/>
+        </w:rPr>
+        <w:t>tra orilla. El humo de las fogatas de otras familias se ve</w:t>
+      </w:r>
+      <w:r>
+        <w:rPr>
+          <w:i/>
+          <w:iCs/>
+          <w:color w:val="000000"/>
+          <w:sz w:val="22"/>
+          <w:szCs w:val="22"/>
+        </w:rPr>
+        <w:t xml:space="preserve"> cerca, en el horizonte.</w:t>
       </w:r>
     </w:p>
     <w:p>
@@ -22066,7 +22360,19 @@
         <w:rPr>
           <w:color w:val="000000" w:themeColor="text1"/>
         </w:rPr>
-        <w:t>ALGORITM: Lo lograron porque pensaron como exploradores inteligentes: primero dividieron el problema en partes pequeñas, y cuando algo falló no se rindieron... lo encontraron y lo arreglaron. Eso es pensar computacionalmente.</w:t>
+        <w:t>ALGORITM: Lo lograron porque pensaron como exploradores inteligentes: primero dividieron el problema en partes pequeñas, y cuando algo falló no se rindieron... lo encontraron y lo arreglaron. Eso es pensar com</w:t>
+      </w:r>
+      <w:r>
+        <w:rPr>
+          <w:color w:val="000000" w:themeColor="text1"/>
+        </w:rPr>
+        <w:t>o un algoritmo</w:t>
+      </w:r>
+      <w:r>
+        <w:rPr>
+          <w:color w:val="000000" w:themeColor="text1"/>
+        </w:rPr>
+        <w:t>.</w:t>
       </w:r>
     </w:p>
     <w:p>
@@ -22080,7 +22386,7 @@
       <w:pPr>
         <w:pStyle w:val="Ttulo2"/>
       </w:pPr>
-      <w:bookmarkStart w:id="25" w:name="_Toc242442875"/>
+      <w:bookmarkStart w:id="25" w:name="_Toc242804644"/>
       <w:r>
         <w:t>1.9. ESCENA FINAL</w:t>
       </w:r>
@@ -22167,7 +22473,27 @@
           <w:sz w:val="22"/>
           <w:szCs w:val="22"/>
         </w:rPr>
-        <w:t>Algoritm gira una última vez y se apaga suavemente. Fundido a negro. Créditos.</w:t>
+        <w:t xml:space="preserve">Algoritm gira una última vez y se apaga suavemente. </w:t>
+      </w:r>
+      <w:r>
+        <w:rPr>
+          <w:i/>
+          <w:iCs/>
+          <w:color w:val="000000" w:themeColor="text1"/>
+          <w:sz w:val="22"/>
+          <w:szCs w:val="22"/>
+        </w:rPr>
+        <w:t>Todo queda en</w:t>
+      </w:r>
+      <w:r>
+        <w:rPr>
+          <w:i/>
+          <w:iCs/>
+          <w:color w:val="000000" w:themeColor="text1"/>
+          <w:sz w:val="22"/>
+          <w:szCs w:val="22"/>
+        </w:rPr>
+        <w:t xml:space="preserve"> negro. Créditos.</w:t>
       </w:r>
     </w:p>
     <w:p>
@@ -22181,7 +22507,7 @@
       <w:pPr>
         <w:pStyle w:val="Ttulo2"/>
       </w:pPr>
-      <w:bookmarkStart w:id="26" w:name="_Toc242442876"/>
+      <w:bookmarkStart w:id="26" w:name="_Toc242804645"/>
       <w:r>
         <w:t>1.10. CONTENIDO OPCIONAL FUERA DEL ALCANCE DEL PROTOTIPO</w:t>
       </w:r>
@@ -22694,7 +23020,7 @@
       <w:pPr>
         <w:pStyle w:val="Ttulo2"/>
       </w:pPr>
-      <w:bookmarkStart w:id="27" w:name="_Toc242442877"/>
+      <w:bookmarkStart w:id="27" w:name="_Toc242804646"/>
       <w:r>
         <w:t>1.11. TRAZABILIDAD ENTRE ESCENAS, MECÁNICAS Y REQUERIMIENTOS</w:t>
       </w:r>
@@ -25437,7 +25763,7 @@
           <w:bCs w:val="0"/>
         </w:rPr>
       </w:pPr>
-      <w:bookmarkStart w:id="28" w:name="_Toc242442878"/>
+      <w:bookmarkStart w:id="28" w:name="_Toc242804647"/>
       <w:r>
         <w:t>1.2. PUNTOS ABIERTOS DEL GUION</w:t>
       </w:r>
@@ -26654,7 +26980,7 @@
       <w:pPr>
         <w:pStyle w:val="Ttulo1"/>
       </w:pPr>
-      <w:bookmarkStart w:id="29" w:name="_Toc242442879"/>
+      <w:bookmarkStart w:id="29" w:name="_Toc242804648"/>
       <w:r>
         <w:t>2. CASOS DE USO</w:t>
       </w:r>
@@ -26670,7 +26996,7 @@
           <w:lang w:val="en-US"/>
         </w:rPr>
       </w:pPr>
-      <w:bookmarkStart w:id="30" w:name="_Toc242442880"/>
+      <w:bookmarkStart w:id="30" w:name="_Toc242804649"/>
       <w:r>
         <w:rPr>
           <w:sz w:val="24"/>
@@ -26914,7 +27240,7 @@
           <w:lang w:val="en-US"/>
         </w:rPr>
       </w:pPr>
-      <w:bookmarkStart w:id="31" w:name="_Toc242442881"/>
+      <w:bookmarkStart w:id="31" w:name="_Toc242804650"/>
       <w:r>
         <w:rPr>
           <w:sz w:val="24"/>
@@ -28211,7 +28537,7 @@
           <w:szCs w:val="24"/>
         </w:rPr>
       </w:pPr>
-      <w:bookmarkStart w:id="32" w:name="_Toc242442882"/>
+      <w:bookmarkStart w:id="32" w:name="_Toc242804651"/>
       <w:r>
         <w:rPr>
           <w:sz w:val="24"/>
@@ -35638,7 +35964,7 @@
       <w:pPr>
         <w:pStyle w:val="Ttulo1"/>
       </w:pPr>
-      <w:bookmarkStart w:id="33" w:name="_Toc242442883"/>
+      <w:bookmarkStart w:id="33" w:name="_Toc242804652"/>
       <w:r>
         <w:t>2. HISTORIAS DE USUARIO</w:t>
       </w:r>
@@ -37126,7 +37452,7 @@
       <w:pPr>
         <w:pStyle w:val="Ttulo1"/>
       </w:pPr>
-      <w:bookmarkStart w:id="34" w:name="_Toc242442884"/>
+      <w:bookmarkStart w:id="34" w:name="_Toc242804653"/>
       <w:r>
         <w:t>3. MATRIZ DE TRAZABILIDAD</w:t>
       </w:r>
@@ -37153,7 +37479,7 @@
           <w:szCs w:val="24"/>
         </w:rPr>
       </w:pPr>
-      <w:bookmarkStart w:id="35" w:name="_Toc242442885"/>
+      <w:bookmarkStart w:id="35" w:name="_Toc242804654"/>
       <w:r>
         <w:rPr>
           <w:sz w:val="24"/>
@@ -38028,7 +38354,7 @@
           <w:lang w:val="en-US"/>
         </w:rPr>
       </w:pPr>
-      <w:bookmarkStart w:id="36" w:name="_Toc242442886"/>
+      <w:bookmarkStart w:id="36" w:name="_Toc242804655"/>
       <w:r>
         <w:rPr>
           <w:sz w:val="24"/>
@@ -38895,7 +39221,7 @@
           <w:lang w:val="en-US"/>
         </w:rPr>
       </w:pPr>
-      <w:bookmarkStart w:id="37" w:name="_Toc242442887"/>
+      <w:bookmarkStart w:id="37" w:name="_Toc242804656"/>
       <w:r>
         <w:rPr>
           <w:sz w:val="24"/>
@@ -39855,7 +40181,7 @@
           <w:lang w:val="en-US"/>
         </w:rPr>
       </w:pPr>
-      <w:bookmarkStart w:id="38" w:name="_Toc242442888"/>
+      <w:bookmarkStart w:id="38" w:name="_Toc242804657"/>
       <w:r>
         <w:rPr>
           <w:sz w:val="24"/>
@@ -40440,7 +40766,7 @@
           <w:szCs w:val="24"/>
         </w:rPr>
       </w:pPr>
-      <w:bookmarkStart w:id="39" w:name="_Toc242442889"/>
+      <w:bookmarkStart w:id="39" w:name="_Toc242804658"/>
       <w:r>
         <w:rPr>
           <w:sz w:val="24"/>
@@ -42138,7 +42464,7 @@
           <w:szCs w:val="24"/>
         </w:rPr>
       </w:pPr>
-      <w:bookmarkStart w:id="40" w:name="_Toc242442890"/>
+      <w:bookmarkStart w:id="40" w:name="_Toc242804659"/>
       <w:r>
         <w:rPr>
           <w:sz w:val="24"/>
@@ -42840,7 +43166,7 @@
       <w:pPr>
         <w:pStyle w:val="Ttulo1"/>
       </w:pPr>
-      <w:bookmarkStart w:id="41" w:name="_Toc242442891"/>
+      <w:bookmarkStart w:id="41" w:name="_Toc242804660"/>
       <w:r>
         <w:lastRenderedPageBreak/>
         <w:t>4. ARQUITECTURA DE SOFTWARE</w:t>
@@ -42855,7 +43181,7 @@
           <w:bCs w:val="0"/>
         </w:rPr>
       </w:pPr>
-      <w:bookmarkStart w:id="42" w:name="_Toc242442892"/>
+      <w:bookmarkStart w:id="42" w:name="_Toc242804661"/>
       <w:r>
         <w:t>4.1 Decisión arquitectónica</w:t>
       </w:r>
@@ -42935,7 +43261,7 @@
           <w:bCs w:val="0"/>
         </w:rPr>
       </w:pPr>
-      <w:bookmarkStart w:id="43" w:name="_Toc242442893"/>
+      <w:bookmarkStart w:id="43" w:name="_Toc242804662"/>
       <w:r>
         <w:t>4.2 Patrones que componen la arquitectura</w:t>
       </w:r>
@@ -43090,7 +43416,7 @@
           <w:bCs w:val="0"/>
         </w:rPr>
       </w:pPr>
-      <w:bookmarkStart w:id="44" w:name="_Toc242442894"/>
+      <w:bookmarkStart w:id="44" w:name="_Toc242804663"/>
       <w:r>
         <w:t>4.3 Flujo de estados del juego</w:t>
       </w:r>
@@ -43477,7 +43803,7 @@
           <w:bCs w:val="0"/>
         </w:rPr>
       </w:pPr>
-      <w:bookmarkStart w:id="45" w:name="_Toc242442895"/>
+      <w:bookmarkStart w:id="45" w:name="_Toc242804664"/>
       <w:r>
         <w:t>4.4 Módulos principales del sistema</w:t>
       </w:r>
@@ -43789,7 +44115,7 @@
           <w:bCs w:val="0"/>
         </w:rPr>
       </w:pPr>
-      <w:bookmarkStart w:id="46" w:name="_Toc242442896"/>
+      <w:bookmarkStart w:id="46" w:name="_Toc242804665"/>
       <w:r>
         <w:t>4.5 Justificación frente a otras alternativas</w:t>
       </w:r>
@@ -43946,7 +44272,7 @@
           <w:szCs w:val="22"/>
         </w:rPr>
       </w:pPr>
-      <w:bookmarkStart w:id="47" w:name="_Toc242442897"/>
+      <w:bookmarkStart w:id="47" w:name="_Toc242804666"/>
       <w:r>
         <w:t>5. CONTROL DE CAMBIOS</w:t>
       </w:r>
@@ -44554,6 +44880,73 @@
                 <w:szCs w:val="20"/>
               </w:rPr>
               <w:lastRenderedPageBreak/>
+              <w:t>Santiago Benavides Rey / Santiago Valdiri García</w:t>
+            </w:r>
+          </w:p>
+        </w:tc>
+      </w:tr>
+      <w:tr>
+        <w:trPr>
+          <w:trHeight w:val="300"/>
+        </w:trPr>
+        <w:tc>
+          <w:tcPr>
+            <w:tcW w:w="1395" w:type="dxa"/>
+          </w:tcPr>
+          <w:p>
+            <w:pPr>
+              <w:rPr>
+                <w:sz w:val="20"/>
+                <w:szCs w:val="20"/>
+              </w:rPr>
+            </w:pPr>
+            <w:r>
+              <w:rPr>
+                <w:sz w:val="20"/>
+                <w:szCs w:val="20"/>
+              </w:rPr>
+              <w:t>13/10/2026</w:t>
+            </w:r>
+          </w:p>
+        </w:tc>
+        <w:tc>
+          <w:tcPr>
+            <w:tcW w:w="5385" w:type="dxa"/>
+          </w:tcPr>
+          <w:p>
+            <w:pPr>
+              <w:rPr>
+                <w:sz w:val="20"/>
+                <w:szCs w:val="20"/>
+                <w:lang w:val="es-ES"/>
+              </w:rPr>
+            </w:pPr>
+            <w:r>
+              <w:rPr>
+                <w:sz w:val="20"/>
+                <w:szCs w:val="20"/>
+                <w:lang w:val="es-ES"/>
+              </w:rPr>
+              <w:t>Cierra INC-157. Vocabulario adaptado a estudiantes de grado quinto tras la sesión de evaluación. Guion 1.3.1, 1.4.1, 1.4.2, 1.4.4, 1.5, 1.6.1, 1.7, 1.8.1, 1.8.2, 1.8.4 y 1.9: intemperie, maleza, silueta, estela, crepita, irregulares, abruptamente, estabilidad, civilización (en las narraciones de 1.7, 1.8.4 y 1.9) y computacionalmente, entre otras, y la tarea «Armar la balsa» en lugar de «Ensamblar la balsa». No cambia ninguna mecánica ni requisito.</w:t>
+            </w:r>
+          </w:p>
+        </w:tc>
+        <w:tc>
+          <w:tcPr>
+            <w:tcW w:w="2670" w:type="dxa"/>
+          </w:tcPr>
+          <w:p>
+            <w:pPr>
+              <w:rPr>
+                <w:sz w:val="20"/>
+                <w:szCs w:val="20"/>
+              </w:rPr>
+            </w:pPr>
+            <w:r>
+              <w:rPr>
+                <w:sz w:val="20"/>
+                <w:szCs w:val="20"/>
+              </w:rPr>
               <w:t>Santiago Benavides Rey / Santiago Valdiri García</w:t>
             </w:r>
           </w:p>

</xml_diff>

<commit_message>
Fifth grade in the filed OE1, OE2, user stories and architecture with their change rows; authorization forms for the Familia Anonaky authors and the art producer; thesis 5.3 in the past and new chapters 10 Conclusions and 11 Recommendations (INC-151)
</commit_message>
<xml_diff>
--- a/docs/Solucion_OE2_Diseno_final.docx
+++ b/docs/Solucion_OE2_Diseno_final.docx
@@ -34,7 +34,7 @@
           <w:r>
             <w:fldChar w:fldCharType="separate"/>
           </w:r>
-          <w:hyperlink w:anchor="_Toc242804619" w:history="1">
+          <w:hyperlink w:anchor="_Toc242810857" w:history="1">
             <w:r>
               <w:rPr>
                 <w:rStyle w:val="Hipervnculo"/>
@@ -61,7 +61,7 @@
                 <w:noProof/>
                 <w:webHidden/>
               </w:rPr>
-              <w:instrText xml:space="preserve"> PAGEREF _Toc242804619 \h </w:instrText>
+              <w:instrText xml:space="preserve"> PAGEREF _Toc242810857 \h </w:instrText>
             </w:r>
             <w:r>
               <w:rPr>
@@ -105,7 +105,7 @@
               <w14:ligatures w14:val="standardContextual"/>
             </w:rPr>
           </w:pPr>
-          <w:hyperlink w:anchor="_Toc242804620" w:history="1">
+          <w:hyperlink w:anchor="_Toc242810858" w:history="1">
             <w:r>
               <w:rPr>
                 <w:rStyle w:val="Hipervnculo"/>
@@ -132,7 +132,7 @@
                 <w:noProof/>
                 <w:webHidden/>
               </w:rPr>
-              <w:instrText xml:space="preserve"> PAGEREF _Toc242804620 \h </w:instrText>
+              <w:instrText xml:space="preserve"> PAGEREF _Toc242810858 \h </w:instrText>
             </w:r>
             <w:r>
               <w:rPr>
@@ -176,7 +176,7 @@
               <w14:ligatures w14:val="standardContextual"/>
             </w:rPr>
           </w:pPr>
-          <w:hyperlink w:anchor="_Toc242804621" w:history="1">
+          <w:hyperlink w:anchor="_Toc242810859" w:history="1">
             <w:r>
               <w:rPr>
                 <w:rStyle w:val="Hipervnculo"/>
@@ -203,7 +203,7 @@
                 <w:noProof/>
                 <w:webHidden/>
               </w:rPr>
-              <w:instrText xml:space="preserve"> PAGEREF _Toc242804621 \h </w:instrText>
+              <w:instrText xml:space="preserve"> PAGEREF _Toc242810859 \h </w:instrText>
             </w:r>
             <w:r>
               <w:rPr>
@@ -247,7 +247,7 @@
               <w14:ligatures w14:val="standardContextual"/>
             </w:rPr>
           </w:pPr>
-          <w:hyperlink w:anchor="_Toc242804622" w:history="1">
+          <w:hyperlink w:anchor="_Toc242810860" w:history="1">
             <w:r>
               <w:rPr>
                 <w:rStyle w:val="Hipervnculo"/>
@@ -274,7 +274,7 @@
                 <w:noProof/>
                 <w:webHidden/>
               </w:rPr>
-              <w:instrText xml:space="preserve"> PAGEREF _Toc242804622 \h </w:instrText>
+              <w:instrText xml:space="preserve"> PAGEREF _Toc242810860 \h </w:instrText>
             </w:r>
             <w:r>
               <w:rPr>
@@ -318,7 +318,7 @@
               <w14:ligatures w14:val="standardContextual"/>
             </w:rPr>
           </w:pPr>
-          <w:hyperlink w:anchor="_Toc242804623" w:history="1">
+          <w:hyperlink w:anchor="_Toc242810861" w:history="1">
             <w:r>
               <w:rPr>
                 <w:rStyle w:val="Hipervnculo"/>
@@ -345,7 +345,7 @@
                 <w:noProof/>
                 <w:webHidden/>
               </w:rPr>
-              <w:instrText xml:space="preserve"> PAGEREF _Toc242804623 \h </w:instrText>
+              <w:instrText xml:space="preserve"> PAGEREF _Toc242810861 \h </w:instrText>
             </w:r>
             <w:r>
               <w:rPr>
@@ -389,7 +389,7 @@
               <w14:ligatures w14:val="standardContextual"/>
             </w:rPr>
           </w:pPr>
-          <w:hyperlink w:anchor="_Toc242804624" w:history="1">
+          <w:hyperlink w:anchor="_Toc242810862" w:history="1">
             <w:r>
               <w:rPr>
                 <w:rStyle w:val="Hipervnculo"/>
@@ -417,7 +417,7 @@
                 <w:noProof/>
                 <w:webHidden/>
               </w:rPr>
-              <w:instrText xml:space="preserve"> PAGEREF _Toc242804624 \h </w:instrText>
+              <w:instrText xml:space="preserve"> PAGEREF _Toc242810862 \h </w:instrText>
             </w:r>
             <w:r>
               <w:rPr>
@@ -461,7 +461,7 @@
               <w14:ligatures w14:val="standardContextual"/>
             </w:rPr>
           </w:pPr>
-          <w:hyperlink w:anchor="_Toc242804625" w:history="1">
+          <w:hyperlink w:anchor="_Toc242810863" w:history="1">
             <w:r>
               <w:rPr>
                 <w:rStyle w:val="Hipervnculo"/>
@@ -488,7 +488,7 @@
                 <w:noProof/>
                 <w:webHidden/>
               </w:rPr>
-              <w:instrText xml:space="preserve"> PAGEREF _Toc242804625 \h </w:instrText>
+              <w:instrText xml:space="preserve"> PAGEREF _Toc242810863 \h </w:instrText>
             </w:r>
             <w:r>
               <w:rPr>
@@ -532,7 +532,7 @@
               <w14:ligatures w14:val="standardContextual"/>
             </w:rPr>
           </w:pPr>
-          <w:hyperlink w:anchor="_Toc242804626" w:history="1">
+          <w:hyperlink w:anchor="_Toc242810864" w:history="1">
             <w:r>
               <w:rPr>
                 <w:rStyle w:val="Hipervnculo"/>
@@ -559,7 +559,7 @@
                 <w:noProof/>
                 <w:webHidden/>
               </w:rPr>
-              <w:instrText xml:space="preserve"> PAGEREF _Toc242804626 \h </w:instrText>
+              <w:instrText xml:space="preserve"> PAGEREF _Toc242810864 \h </w:instrText>
             </w:r>
             <w:r>
               <w:rPr>
@@ -603,7 +603,7 @@
               <w14:ligatures w14:val="standardContextual"/>
             </w:rPr>
           </w:pPr>
-          <w:hyperlink w:anchor="_Toc242804627" w:history="1">
+          <w:hyperlink w:anchor="_Toc242810865" w:history="1">
             <w:r>
               <w:rPr>
                 <w:rStyle w:val="Hipervnculo"/>
@@ -630,7 +630,7 @@
                 <w:noProof/>
                 <w:webHidden/>
               </w:rPr>
-              <w:instrText xml:space="preserve"> PAGEREF _Toc242804627 \h </w:instrText>
+              <w:instrText xml:space="preserve"> PAGEREF _Toc242810865 \h </w:instrText>
             </w:r>
             <w:r>
               <w:rPr>
@@ -674,7 +674,7 @@
               <w14:ligatures w14:val="standardContextual"/>
             </w:rPr>
           </w:pPr>
-          <w:hyperlink w:anchor="_Toc242804628" w:history="1">
+          <w:hyperlink w:anchor="_Toc242810866" w:history="1">
             <w:r>
               <w:rPr>
                 <w:rStyle w:val="Hipervnculo"/>
@@ -701,7 +701,7 @@
                 <w:noProof/>
                 <w:webHidden/>
               </w:rPr>
-              <w:instrText xml:space="preserve"> PAGEREF _Toc242804628 \h </w:instrText>
+              <w:instrText xml:space="preserve"> PAGEREF _Toc242810866 \h </w:instrText>
             </w:r>
             <w:r>
               <w:rPr>
@@ -745,7 +745,7 @@
               <w14:ligatures w14:val="standardContextual"/>
             </w:rPr>
           </w:pPr>
-          <w:hyperlink w:anchor="_Toc242804629" w:history="1">
+          <w:hyperlink w:anchor="_Toc242810867" w:history="1">
             <w:r>
               <w:rPr>
                 <w:rStyle w:val="Hipervnculo"/>
@@ -772,7 +772,7 @@
                 <w:noProof/>
                 <w:webHidden/>
               </w:rPr>
-              <w:instrText xml:space="preserve"> PAGEREF _Toc242804629 \h </w:instrText>
+              <w:instrText xml:space="preserve"> PAGEREF _Toc242810867 \h </w:instrText>
             </w:r>
             <w:r>
               <w:rPr>
@@ -816,7 +816,7 @@
               <w14:ligatures w14:val="standardContextual"/>
             </w:rPr>
           </w:pPr>
-          <w:hyperlink w:anchor="_Toc242804630" w:history="1">
+          <w:hyperlink w:anchor="_Toc242810868" w:history="1">
             <w:r>
               <w:rPr>
                 <w:rStyle w:val="Hipervnculo"/>
@@ -843,7 +843,7 @@
                 <w:noProof/>
                 <w:webHidden/>
               </w:rPr>
-              <w:instrText xml:space="preserve"> PAGEREF _Toc242804630 \h </w:instrText>
+              <w:instrText xml:space="preserve"> PAGEREF _Toc242810868 \h </w:instrText>
             </w:r>
             <w:r>
               <w:rPr>
@@ -887,7 +887,7 @@
               <w14:ligatures w14:val="standardContextual"/>
             </w:rPr>
           </w:pPr>
-          <w:hyperlink w:anchor="_Toc242804631" w:history="1">
+          <w:hyperlink w:anchor="_Toc242810869" w:history="1">
             <w:r>
               <w:rPr>
                 <w:rStyle w:val="Hipervnculo"/>
@@ -914,7 +914,7 @@
                 <w:noProof/>
                 <w:webHidden/>
               </w:rPr>
-              <w:instrText xml:space="preserve"> PAGEREF _Toc242804631 \h </w:instrText>
+              <w:instrText xml:space="preserve"> PAGEREF _Toc242810869 \h </w:instrText>
             </w:r>
             <w:r>
               <w:rPr>
@@ -958,7 +958,7 @@
               <w14:ligatures w14:val="standardContextual"/>
             </w:rPr>
           </w:pPr>
-          <w:hyperlink w:anchor="_Toc242804632" w:history="1">
+          <w:hyperlink w:anchor="_Toc242810870" w:history="1">
             <w:r>
               <w:rPr>
                 <w:rStyle w:val="Hipervnculo"/>
@@ -985,7 +985,7 @@
                 <w:noProof/>
                 <w:webHidden/>
               </w:rPr>
-              <w:instrText xml:space="preserve"> PAGEREF _Toc242804632 \h </w:instrText>
+              <w:instrText xml:space="preserve"> PAGEREF _Toc242810870 \h </w:instrText>
             </w:r>
             <w:r>
               <w:rPr>
@@ -1029,7 +1029,7 @@
               <w14:ligatures w14:val="standardContextual"/>
             </w:rPr>
           </w:pPr>
-          <w:hyperlink w:anchor="_Toc242804633" w:history="1">
+          <w:hyperlink w:anchor="_Toc242810871" w:history="1">
             <w:r>
               <w:rPr>
                 <w:rStyle w:val="Hipervnculo"/>
@@ -1056,7 +1056,7 @@
                 <w:noProof/>
                 <w:webHidden/>
               </w:rPr>
-              <w:instrText xml:space="preserve"> PAGEREF _Toc242804633 \h </w:instrText>
+              <w:instrText xml:space="preserve"> PAGEREF _Toc242810871 \h </w:instrText>
             </w:r>
             <w:r>
               <w:rPr>
@@ -1100,7 +1100,7 @@
               <w14:ligatures w14:val="standardContextual"/>
             </w:rPr>
           </w:pPr>
-          <w:hyperlink w:anchor="_Toc242804634" w:history="1">
+          <w:hyperlink w:anchor="_Toc242810872" w:history="1">
             <w:r>
               <w:rPr>
                 <w:rStyle w:val="Hipervnculo"/>
@@ -1127,7 +1127,7 @@
                 <w:noProof/>
                 <w:webHidden/>
               </w:rPr>
-              <w:instrText xml:space="preserve"> PAGEREF _Toc242804634 \h </w:instrText>
+              <w:instrText xml:space="preserve"> PAGEREF _Toc242810872 \h </w:instrText>
             </w:r>
             <w:r>
               <w:rPr>
@@ -1171,7 +1171,7 @@
               <w14:ligatures w14:val="standardContextual"/>
             </w:rPr>
           </w:pPr>
-          <w:hyperlink w:anchor="_Toc242804635" w:history="1">
+          <w:hyperlink w:anchor="_Toc242810873" w:history="1">
             <w:r>
               <w:rPr>
                 <w:rStyle w:val="Hipervnculo"/>
@@ -1198,7 +1198,7 @@
                 <w:noProof/>
                 <w:webHidden/>
               </w:rPr>
-              <w:instrText xml:space="preserve"> PAGEREF _Toc242804635 \h </w:instrText>
+              <w:instrText xml:space="preserve"> PAGEREF _Toc242810873 \h </w:instrText>
             </w:r>
             <w:r>
               <w:rPr>
@@ -1242,7 +1242,7 @@
               <w14:ligatures w14:val="standardContextual"/>
             </w:rPr>
           </w:pPr>
-          <w:hyperlink w:anchor="_Toc242804636" w:history="1">
+          <w:hyperlink w:anchor="_Toc242810874" w:history="1">
             <w:r>
               <w:rPr>
                 <w:rStyle w:val="Hipervnculo"/>
@@ -1269,7 +1269,7 @@
                 <w:noProof/>
                 <w:webHidden/>
               </w:rPr>
-              <w:instrText xml:space="preserve"> PAGEREF _Toc242804636 \h </w:instrText>
+              <w:instrText xml:space="preserve"> PAGEREF _Toc242810874 \h </w:instrText>
             </w:r>
             <w:r>
               <w:rPr>
@@ -1313,7 +1313,7 @@
               <w14:ligatures w14:val="standardContextual"/>
             </w:rPr>
           </w:pPr>
-          <w:hyperlink w:anchor="_Toc242804637" w:history="1">
+          <w:hyperlink w:anchor="_Toc242810875" w:history="1">
             <w:r>
               <w:rPr>
                 <w:rStyle w:val="Hipervnculo"/>
@@ -1340,7 +1340,7 @@
                 <w:noProof/>
                 <w:webHidden/>
               </w:rPr>
-              <w:instrText xml:space="preserve"> PAGEREF _Toc242804637 \h </w:instrText>
+              <w:instrText xml:space="preserve"> PAGEREF _Toc242810875 \h </w:instrText>
             </w:r>
             <w:r>
               <w:rPr>
@@ -1384,7 +1384,7 @@
               <w14:ligatures w14:val="standardContextual"/>
             </w:rPr>
           </w:pPr>
-          <w:hyperlink w:anchor="_Toc242804638" w:history="1">
+          <w:hyperlink w:anchor="_Toc242810876" w:history="1">
             <w:r>
               <w:rPr>
                 <w:rStyle w:val="Hipervnculo"/>
@@ -1411,7 +1411,7 @@
                 <w:noProof/>
                 <w:webHidden/>
               </w:rPr>
-              <w:instrText xml:space="preserve"> PAGEREF _Toc242804638 \h </w:instrText>
+              <w:instrText xml:space="preserve"> PAGEREF _Toc242810876 \h </w:instrText>
             </w:r>
             <w:r>
               <w:rPr>
@@ -1455,7 +1455,7 @@
               <w14:ligatures w14:val="standardContextual"/>
             </w:rPr>
           </w:pPr>
-          <w:hyperlink w:anchor="_Toc242804639" w:history="1">
+          <w:hyperlink w:anchor="_Toc242810877" w:history="1">
             <w:r>
               <w:rPr>
                 <w:rStyle w:val="Hipervnculo"/>
@@ -1482,7 +1482,7 @@
                 <w:noProof/>
                 <w:webHidden/>
               </w:rPr>
-              <w:instrText xml:space="preserve"> PAGEREF _Toc242804639 \h </w:instrText>
+              <w:instrText xml:space="preserve"> PAGEREF _Toc242810877 \h </w:instrText>
             </w:r>
             <w:r>
               <w:rPr>
@@ -1526,7 +1526,7 @@
               <w14:ligatures w14:val="standardContextual"/>
             </w:rPr>
           </w:pPr>
-          <w:hyperlink w:anchor="_Toc242804640" w:history="1">
+          <w:hyperlink w:anchor="_Toc242810878" w:history="1">
             <w:r>
               <w:rPr>
                 <w:rStyle w:val="Hipervnculo"/>
@@ -1553,7 +1553,7 @@
                 <w:noProof/>
                 <w:webHidden/>
               </w:rPr>
-              <w:instrText xml:space="preserve"> PAGEREF _Toc242804640 \h </w:instrText>
+              <w:instrText xml:space="preserve"> PAGEREF _Toc242810878 \h </w:instrText>
             </w:r>
             <w:r>
               <w:rPr>
@@ -1597,7 +1597,7 @@
               <w14:ligatures w14:val="standardContextual"/>
             </w:rPr>
           </w:pPr>
-          <w:hyperlink w:anchor="_Toc242804641" w:history="1">
+          <w:hyperlink w:anchor="_Toc242810879" w:history="1">
             <w:r>
               <w:rPr>
                 <w:rStyle w:val="Hipervnculo"/>
@@ -1624,7 +1624,7 @@
                 <w:noProof/>
                 <w:webHidden/>
               </w:rPr>
-              <w:instrText xml:space="preserve"> PAGEREF _Toc242804641 \h </w:instrText>
+              <w:instrText xml:space="preserve"> PAGEREF _Toc242810879 \h </w:instrText>
             </w:r>
             <w:r>
               <w:rPr>
@@ -1668,7 +1668,7 @@
               <w14:ligatures w14:val="standardContextual"/>
             </w:rPr>
           </w:pPr>
-          <w:hyperlink w:anchor="_Toc242804642" w:history="1">
+          <w:hyperlink w:anchor="_Toc242810880" w:history="1">
             <w:r>
               <w:rPr>
                 <w:rStyle w:val="Hipervnculo"/>
@@ -1695,7 +1695,7 @@
                 <w:noProof/>
                 <w:webHidden/>
               </w:rPr>
-              <w:instrText xml:space="preserve"> PAGEREF _Toc242804642 \h </w:instrText>
+              <w:instrText xml:space="preserve"> PAGEREF _Toc242810880 \h </w:instrText>
             </w:r>
             <w:r>
               <w:rPr>
@@ -1739,7 +1739,7 @@
               <w14:ligatures w14:val="standardContextual"/>
             </w:rPr>
           </w:pPr>
-          <w:hyperlink w:anchor="_Toc242804643" w:history="1">
+          <w:hyperlink w:anchor="_Toc242810881" w:history="1">
             <w:r>
               <w:rPr>
                 <w:rStyle w:val="Hipervnculo"/>
@@ -1766,7 +1766,7 @@
                 <w:noProof/>
                 <w:webHidden/>
               </w:rPr>
-              <w:instrText xml:space="preserve"> PAGEREF _Toc242804643 \h </w:instrText>
+              <w:instrText xml:space="preserve"> PAGEREF _Toc242810881 \h </w:instrText>
             </w:r>
             <w:r>
               <w:rPr>
@@ -1810,7 +1810,7 @@
               <w14:ligatures w14:val="standardContextual"/>
             </w:rPr>
           </w:pPr>
-          <w:hyperlink w:anchor="_Toc242804644" w:history="1">
+          <w:hyperlink w:anchor="_Toc242810882" w:history="1">
             <w:r>
               <w:rPr>
                 <w:rStyle w:val="Hipervnculo"/>
@@ -1837,7 +1837,7 @@
                 <w:noProof/>
                 <w:webHidden/>
               </w:rPr>
-              <w:instrText xml:space="preserve"> PAGEREF _Toc242804644 \h </w:instrText>
+              <w:instrText xml:space="preserve"> PAGEREF _Toc242810882 \h </w:instrText>
             </w:r>
             <w:r>
               <w:rPr>
@@ -1881,7 +1881,7 @@
               <w14:ligatures w14:val="standardContextual"/>
             </w:rPr>
           </w:pPr>
-          <w:hyperlink w:anchor="_Toc242804645" w:history="1">
+          <w:hyperlink w:anchor="_Toc242810883" w:history="1">
             <w:r>
               <w:rPr>
                 <w:rStyle w:val="Hipervnculo"/>
@@ -1908,7 +1908,7 @@
                 <w:noProof/>
                 <w:webHidden/>
               </w:rPr>
-              <w:instrText xml:space="preserve"> PAGEREF _Toc242804645 \h </w:instrText>
+              <w:instrText xml:space="preserve"> PAGEREF _Toc242810883 \h </w:instrText>
             </w:r>
             <w:r>
               <w:rPr>
@@ -1952,7 +1952,7 @@
               <w14:ligatures w14:val="standardContextual"/>
             </w:rPr>
           </w:pPr>
-          <w:hyperlink w:anchor="_Toc242804646" w:history="1">
+          <w:hyperlink w:anchor="_Toc242810884" w:history="1">
             <w:r>
               <w:rPr>
                 <w:rStyle w:val="Hipervnculo"/>
@@ -1979,7 +1979,7 @@
                 <w:noProof/>
                 <w:webHidden/>
               </w:rPr>
-              <w:instrText xml:space="preserve"> PAGEREF _Toc242804646 \h </w:instrText>
+              <w:instrText xml:space="preserve"> PAGEREF _Toc242810884 \h </w:instrText>
             </w:r>
             <w:r>
               <w:rPr>
@@ -2023,7 +2023,7 @@
               <w14:ligatures w14:val="standardContextual"/>
             </w:rPr>
           </w:pPr>
-          <w:hyperlink w:anchor="_Toc242804647" w:history="1">
+          <w:hyperlink w:anchor="_Toc242810885" w:history="1">
             <w:r>
               <w:rPr>
                 <w:rStyle w:val="Hipervnculo"/>
@@ -2050,7 +2050,7 @@
                 <w:noProof/>
                 <w:webHidden/>
               </w:rPr>
-              <w:instrText xml:space="preserve"> PAGEREF _Toc242804647 \h </w:instrText>
+              <w:instrText xml:space="preserve"> PAGEREF _Toc242810885 \h </w:instrText>
             </w:r>
             <w:r>
               <w:rPr>
@@ -2094,7 +2094,7 @@
               <w14:ligatures w14:val="standardContextual"/>
             </w:rPr>
           </w:pPr>
-          <w:hyperlink w:anchor="_Toc242804648" w:history="1">
+          <w:hyperlink w:anchor="_Toc242810886" w:history="1">
             <w:r>
               <w:rPr>
                 <w:rStyle w:val="Hipervnculo"/>
@@ -2121,7 +2121,7 @@
                 <w:noProof/>
                 <w:webHidden/>
               </w:rPr>
-              <w:instrText xml:space="preserve"> PAGEREF _Toc242804648 \h </w:instrText>
+              <w:instrText xml:space="preserve"> PAGEREF _Toc242810886 \h </w:instrText>
             </w:r>
             <w:r>
               <w:rPr>
@@ -2165,7 +2165,7 @@
               <w14:ligatures w14:val="standardContextual"/>
             </w:rPr>
           </w:pPr>
-          <w:hyperlink w:anchor="_Toc242804649" w:history="1">
+          <w:hyperlink w:anchor="_Toc242810887" w:history="1">
             <w:r>
               <w:rPr>
                 <w:rStyle w:val="Hipervnculo"/>
@@ -2193,7 +2193,7 @@
                 <w:noProof/>
                 <w:webHidden/>
               </w:rPr>
-              <w:instrText xml:space="preserve"> PAGEREF _Toc242804649 \h </w:instrText>
+              <w:instrText xml:space="preserve"> PAGEREF _Toc242810887 \h </w:instrText>
             </w:r>
             <w:r>
               <w:rPr>
@@ -2237,7 +2237,7 @@
               <w14:ligatures w14:val="standardContextual"/>
             </w:rPr>
           </w:pPr>
-          <w:hyperlink w:anchor="_Toc242804650" w:history="1">
+          <w:hyperlink w:anchor="_Toc242810888" w:history="1">
             <w:r>
               <w:rPr>
                 <w:rStyle w:val="Hipervnculo"/>
@@ -2265,7 +2265,7 @@
                 <w:noProof/>
                 <w:webHidden/>
               </w:rPr>
-              <w:instrText xml:space="preserve"> PAGEREF _Toc242804650 \h </w:instrText>
+              <w:instrText xml:space="preserve"> PAGEREF _Toc242810888 \h </w:instrText>
             </w:r>
             <w:r>
               <w:rPr>
@@ -2309,7 +2309,7 @@
               <w14:ligatures w14:val="standardContextual"/>
             </w:rPr>
           </w:pPr>
-          <w:hyperlink w:anchor="_Toc242804651" w:history="1">
+          <w:hyperlink w:anchor="_Toc242810889" w:history="1">
             <w:r>
               <w:rPr>
                 <w:rStyle w:val="Hipervnculo"/>
@@ -2336,7 +2336,7 @@
                 <w:noProof/>
                 <w:webHidden/>
               </w:rPr>
-              <w:instrText xml:space="preserve"> PAGEREF _Toc242804651 \h </w:instrText>
+              <w:instrText xml:space="preserve"> PAGEREF _Toc242810889 \h </w:instrText>
             </w:r>
             <w:r>
               <w:rPr>
@@ -2380,7 +2380,7 @@
               <w14:ligatures w14:val="standardContextual"/>
             </w:rPr>
           </w:pPr>
-          <w:hyperlink w:anchor="_Toc242804652" w:history="1">
+          <w:hyperlink w:anchor="_Toc242810890" w:history="1">
             <w:r>
               <w:rPr>
                 <w:rStyle w:val="Hipervnculo"/>
@@ -2407,7 +2407,7 @@
                 <w:noProof/>
                 <w:webHidden/>
               </w:rPr>
-              <w:instrText xml:space="preserve"> PAGEREF _Toc242804652 \h </w:instrText>
+              <w:instrText xml:space="preserve"> PAGEREF _Toc242810890 \h </w:instrText>
             </w:r>
             <w:r>
               <w:rPr>
@@ -2451,7 +2451,7 @@
               <w14:ligatures w14:val="standardContextual"/>
             </w:rPr>
           </w:pPr>
-          <w:hyperlink w:anchor="_Toc242804653" w:history="1">
+          <w:hyperlink w:anchor="_Toc242810891" w:history="1">
             <w:r>
               <w:rPr>
                 <w:rStyle w:val="Hipervnculo"/>
@@ -2478,7 +2478,7 @@
                 <w:noProof/>
                 <w:webHidden/>
               </w:rPr>
-              <w:instrText xml:space="preserve"> PAGEREF _Toc242804653 \h </w:instrText>
+              <w:instrText xml:space="preserve"> PAGEREF _Toc242810891 \h </w:instrText>
             </w:r>
             <w:r>
               <w:rPr>
@@ -2522,7 +2522,7 @@
               <w14:ligatures w14:val="standardContextual"/>
             </w:rPr>
           </w:pPr>
-          <w:hyperlink w:anchor="_Toc242804654" w:history="1">
+          <w:hyperlink w:anchor="_Toc242810892" w:history="1">
             <w:r>
               <w:rPr>
                 <w:rStyle w:val="Hipervnculo"/>
@@ -2549,7 +2549,7 @@
                 <w:noProof/>
                 <w:webHidden/>
               </w:rPr>
-              <w:instrText xml:space="preserve"> PAGEREF _Toc242804654 \h </w:instrText>
+              <w:instrText xml:space="preserve"> PAGEREF _Toc242810892 \h </w:instrText>
             </w:r>
             <w:r>
               <w:rPr>
@@ -2593,7 +2593,7 @@
               <w14:ligatures w14:val="standardContextual"/>
             </w:rPr>
           </w:pPr>
-          <w:hyperlink w:anchor="_Toc242804655" w:history="1">
+          <w:hyperlink w:anchor="_Toc242810893" w:history="1">
             <w:r>
               <w:rPr>
                 <w:rStyle w:val="Hipervnculo"/>
@@ -2621,7 +2621,7 @@
                 <w:noProof/>
                 <w:webHidden/>
               </w:rPr>
-              <w:instrText xml:space="preserve"> PAGEREF _Toc242804655 \h </w:instrText>
+              <w:instrText xml:space="preserve"> PAGEREF _Toc242810893 \h </w:instrText>
             </w:r>
             <w:r>
               <w:rPr>
@@ -2665,7 +2665,7 @@
               <w14:ligatures w14:val="standardContextual"/>
             </w:rPr>
           </w:pPr>
-          <w:hyperlink w:anchor="_Toc242804656" w:history="1">
+          <w:hyperlink w:anchor="_Toc242810894" w:history="1">
             <w:r>
               <w:rPr>
                 <w:rStyle w:val="Hipervnculo"/>
@@ -2693,7 +2693,7 @@
                 <w:noProof/>
                 <w:webHidden/>
               </w:rPr>
-              <w:instrText xml:space="preserve"> PAGEREF _Toc242804656 \h </w:instrText>
+              <w:instrText xml:space="preserve"> PAGEREF _Toc242810894 \h </w:instrText>
             </w:r>
             <w:r>
               <w:rPr>
@@ -2737,7 +2737,7 @@
               <w14:ligatures w14:val="standardContextual"/>
             </w:rPr>
           </w:pPr>
-          <w:hyperlink w:anchor="_Toc242804657" w:history="1">
+          <w:hyperlink w:anchor="_Toc242810895" w:history="1">
             <w:r>
               <w:rPr>
                 <w:rStyle w:val="Hipervnculo"/>
@@ -2765,7 +2765,7 @@
                 <w:noProof/>
                 <w:webHidden/>
               </w:rPr>
-              <w:instrText xml:space="preserve"> PAGEREF _Toc242804657 \h </w:instrText>
+              <w:instrText xml:space="preserve"> PAGEREF _Toc242810895 \h </w:instrText>
             </w:r>
             <w:r>
               <w:rPr>
@@ -2809,7 +2809,7 @@
               <w14:ligatures w14:val="standardContextual"/>
             </w:rPr>
           </w:pPr>
-          <w:hyperlink w:anchor="_Toc242804658" w:history="1">
+          <w:hyperlink w:anchor="_Toc242810896" w:history="1">
             <w:r>
               <w:rPr>
                 <w:rStyle w:val="Hipervnculo"/>
@@ -2836,7 +2836,7 @@
                 <w:noProof/>
                 <w:webHidden/>
               </w:rPr>
-              <w:instrText xml:space="preserve"> PAGEREF _Toc242804658 \h </w:instrText>
+              <w:instrText xml:space="preserve"> PAGEREF _Toc242810896 \h </w:instrText>
             </w:r>
             <w:r>
               <w:rPr>
@@ -2880,7 +2880,7 @@
               <w14:ligatures w14:val="standardContextual"/>
             </w:rPr>
           </w:pPr>
-          <w:hyperlink w:anchor="_Toc242804659" w:history="1">
+          <w:hyperlink w:anchor="_Toc242810897" w:history="1">
             <w:r>
               <w:rPr>
                 <w:rStyle w:val="Hipervnculo"/>
@@ -2907,7 +2907,7 @@
                 <w:noProof/>
                 <w:webHidden/>
               </w:rPr>
-              <w:instrText xml:space="preserve"> PAGEREF _Toc242804659 \h </w:instrText>
+              <w:instrText xml:space="preserve"> PAGEREF _Toc242810897 \h </w:instrText>
             </w:r>
             <w:r>
               <w:rPr>
@@ -2951,7 +2951,7 @@
               <w14:ligatures w14:val="standardContextual"/>
             </w:rPr>
           </w:pPr>
-          <w:hyperlink w:anchor="_Toc242804660" w:history="1">
+          <w:hyperlink w:anchor="_Toc242810898" w:history="1">
             <w:r>
               <w:rPr>
                 <w:rStyle w:val="Hipervnculo"/>
@@ -2978,7 +2978,7 @@
                 <w:noProof/>
                 <w:webHidden/>
               </w:rPr>
-              <w:instrText xml:space="preserve"> PAGEREF _Toc242804660 \h </w:instrText>
+              <w:instrText xml:space="preserve"> PAGEREF _Toc242810898 \h </w:instrText>
             </w:r>
             <w:r>
               <w:rPr>
@@ -3022,7 +3022,7 @@
               <w14:ligatures w14:val="standardContextual"/>
             </w:rPr>
           </w:pPr>
-          <w:hyperlink w:anchor="_Toc242804661" w:history="1">
+          <w:hyperlink w:anchor="_Toc242810899" w:history="1">
             <w:r>
               <w:rPr>
                 <w:rStyle w:val="Hipervnculo"/>
@@ -3049,7 +3049,7 @@
                 <w:noProof/>
                 <w:webHidden/>
               </w:rPr>
-              <w:instrText xml:space="preserve"> PAGEREF _Toc242804661 \h </w:instrText>
+              <w:instrText xml:space="preserve"> PAGEREF _Toc242810899 \h </w:instrText>
             </w:r>
             <w:r>
               <w:rPr>
@@ -3093,7 +3093,7 @@
               <w14:ligatures w14:val="standardContextual"/>
             </w:rPr>
           </w:pPr>
-          <w:hyperlink w:anchor="_Toc242804662" w:history="1">
+          <w:hyperlink w:anchor="_Toc242810900" w:history="1">
             <w:r>
               <w:rPr>
                 <w:rStyle w:val="Hipervnculo"/>
@@ -3120,7 +3120,7 @@
                 <w:noProof/>
                 <w:webHidden/>
               </w:rPr>
-              <w:instrText xml:space="preserve"> PAGEREF _Toc242804662 \h </w:instrText>
+              <w:instrText xml:space="preserve"> PAGEREF _Toc242810900 \h </w:instrText>
             </w:r>
             <w:r>
               <w:rPr>
@@ -3164,7 +3164,7 @@
               <w14:ligatures w14:val="standardContextual"/>
             </w:rPr>
           </w:pPr>
-          <w:hyperlink w:anchor="_Toc242804663" w:history="1">
+          <w:hyperlink w:anchor="_Toc242810901" w:history="1">
             <w:r>
               <w:rPr>
                 <w:rStyle w:val="Hipervnculo"/>
@@ -3191,7 +3191,7 @@
                 <w:noProof/>
                 <w:webHidden/>
               </w:rPr>
-              <w:instrText xml:space="preserve"> PAGEREF _Toc242804663 \h </w:instrText>
+              <w:instrText xml:space="preserve"> PAGEREF _Toc242810901 \h </w:instrText>
             </w:r>
             <w:r>
               <w:rPr>
@@ -3235,7 +3235,7 @@
               <w14:ligatures w14:val="standardContextual"/>
             </w:rPr>
           </w:pPr>
-          <w:hyperlink w:anchor="_Toc242804664" w:history="1">
+          <w:hyperlink w:anchor="_Toc242810902" w:history="1">
             <w:r>
               <w:rPr>
                 <w:rStyle w:val="Hipervnculo"/>
@@ -3262,7 +3262,7 @@
                 <w:noProof/>
                 <w:webHidden/>
               </w:rPr>
-              <w:instrText xml:space="preserve"> PAGEREF _Toc242804664 \h </w:instrText>
+              <w:instrText xml:space="preserve"> PAGEREF _Toc242810902 \h </w:instrText>
             </w:r>
             <w:r>
               <w:rPr>
@@ -3306,7 +3306,7 @@
               <w14:ligatures w14:val="standardContextual"/>
             </w:rPr>
           </w:pPr>
-          <w:hyperlink w:anchor="_Toc242804665" w:history="1">
+          <w:hyperlink w:anchor="_Toc242810903" w:history="1">
             <w:r>
               <w:rPr>
                 <w:rStyle w:val="Hipervnculo"/>
@@ -3333,7 +3333,7 @@
                 <w:noProof/>
                 <w:webHidden/>
               </w:rPr>
-              <w:instrText xml:space="preserve"> PAGEREF _Toc242804665 \h </w:instrText>
+              <w:instrText xml:space="preserve"> PAGEREF _Toc242810903 \h </w:instrText>
             </w:r>
             <w:r>
               <w:rPr>
@@ -3377,7 +3377,7 @@
               <w14:ligatures w14:val="standardContextual"/>
             </w:rPr>
           </w:pPr>
-          <w:hyperlink w:anchor="_Toc242804666" w:history="1">
+          <w:hyperlink w:anchor="_Toc242810904" w:history="1">
             <w:r>
               <w:rPr>
                 <w:rStyle w:val="Hipervnculo"/>
@@ -3404,7 +3404,7 @@
                 <w:noProof/>
                 <w:webHidden/>
               </w:rPr>
-              <w:instrText xml:space="preserve"> PAGEREF _Toc242804666 \h </w:instrText>
+              <w:instrText xml:space="preserve"> PAGEREF _Toc242810904 \h </w:instrText>
             </w:r>
             <w:r>
               <w:rPr>
@@ -3446,7 +3446,7 @@
       <w:pPr>
         <w:pStyle w:val="Ttulo1"/>
       </w:pPr>
-      <w:bookmarkStart w:id="0" w:name="_Toc242804619"/>
+      <w:bookmarkStart w:id="0" w:name="_Toc242810857"/>
       <w:r>
         <w:t>1. GUIA DE DESARROLLO</w:t>
       </w:r>
@@ -3460,7 +3460,7 @@
           <w:bCs w:val="0"/>
         </w:rPr>
       </w:pPr>
-      <w:bookmarkStart w:id="1" w:name="_Toc242804620"/>
+      <w:bookmarkStart w:id="1" w:name="_Toc242810858"/>
       <w:r>
         <w:t>1.1 FICHA GENERAL DEL VIDEOJUEGO</w:t>
       </w:r>
@@ -4002,7 +4002,21 @@
                 <w:sz w:val="20"/>
                 <w:szCs w:val="20"/>
               </w:rPr>
-              <w:t>Estudiantes de grado cuarto de primaria, entre 9 y 11 años.</w:t>
+              <w:t xml:space="preserve">Estudiantes de grado </w:t>
+            </w:r>
+            <w:r>
+              <w:rPr>
+                <w:sz w:val="20"/>
+                <w:szCs w:val="20"/>
+              </w:rPr>
+              <w:t>quin</w:t>
+            </w:r>
+            <w:r>
+              <w:rPr>
+                <w:sz w:val="20"/>
+                <w:szCs w:val="20"/>
+              </w:rPr>
+              <w:t>to de primaria, entre 9 y 11 años.</w:t>
             </w:r>
           </w:p>
         </w:tc>
@@ -4169,7 +4183,7 @@
           <w:bCs w:val="0"/>
         </w:rPr>
       </w:pPr>
-      <w:bookmarkStart w:id="2" w:name="_Toc242804621"/>
+      <w:bookmarkStart w:id="2" w:name="_Toc242810859"/>
       <w:r>
         <w:t>1.1.1 Personajes</w:t>
       </w:r>
@@ -4880,7 +4894,7 @@
           <w:bCs w:val="0"/>
         </w:rPr>
       </w:pPr>
-      <w:bookmarkStart w:id="3" w:name="_Toc242804622"/>
+      <w:bookmarkStart w:id="3" w:name="_Toc242810860"/>
       <w:r>
         <w:t>1.1.2 Estructura de niveles</w:t>
       </w:r>
@@ -5635,7 +5649,7 @@
           <w:bCs w:val="0"/>
         </w:rPr>
       </w:pPr>
-      <w:bookmarkStart w:id="4" w:name="_Toc242804623"/>
+      <w:bookmarkStart w:id="4" w:name="_Toc242810861"/>
       <w:r>
         <w:t>1.2. CONVENCIONES DEL DOCUMENTO</w:t>
       </w:r>
@@ -5731,7 +5745,7 @@
           <w:lang w:val="en-US"/>
         </w:rPr>
       </w:pPr>
-      <w:bookmarkStart w:id="5" w:name="_Toc242804624"/>
+      <w:bookmarkStart w:id="5" w:name="_Toc242810862"/>
       <w:r>
         <w:rPr>
           <w:sz w:val="24"/>
@@ -6344,7 +6358,7 @@
       <w:pPr>
         <w:pStyle w:val="Ttulo2"/>
       </w:pPr>
-      <w:bookmarkStart w:id="6" w:name="_Toc242804625"/>
+      <w:bookmarkStart w:id="6" w:name="_Toc242810863"/>
       <w:r>
         <w:t>1.3. PRÓLOGO Y ESTRUCTURA NARRATIVA</w:t>
       </w:r>
@@ -6390,7 +6404,7 @@
           <w:lang w:val="es-CO"/>
         </w:rPr>
       </w:pPr>
-      <w:bookmarkStart w:id="7" w:name="_Toc242804626"/>
+      <w:bookmarkStart w:id="7" w:name="_Toc242810864"/>
       <w:r>
         <w:rPr>
           <w:lang w:val="es-CO"/>
@@ -6534,7 +6548,7 @@
       <w:pPr>
         <w:pStyle w:val="Ttulo2"/>
       </w:pPr>
-      <w:bookmarkStart w:id="8" w:name="_Toc242804627"/>
+      <w:bookmarkStart w:id="8" w:name="_Toc242810865"/>
       <w:r>
         <w:t>1.4. NIVEL 1 — LA OSCURIDAD</w:t>
       </w:r>
@@ -7096,7 +7110,7 @@
           <w:lang w:val="es-CO"/>
         </w:rPr>
       </w:pPr>
-      <w:bookmarkStart w:id="9" w:name="_Toc242804628"/>
+      <w:bookmarkStart w:id="9" w:name="_Toc242810866"/>
       <w:r>
         <w:rPr>
           <w:lang w:val="es-CO"/>
@@ -7247,7 +7261,7 @@
           <w:lang w:val="es-CO"/>
         </w:rPr>
       </w:pPr>
-      <w:bookmarkStart w:id="10" w:name="_Toc242804629"/>
+      <w:bookmarkStart w:id="10" w:name="_Toc242810867"/>
       <w:r>
         <w:rPr>
           <w:lang w:val="es-CO"/>
@@ -7530,7 +7544,7 @@
           <w:lang w:val="es-CO"/>
         </w:rPr>
       </w:pPr>
-      <w:bookmarkStart w:id="11" w:name="_Toc242804630"/>
+      <w:bookmarkStart w:id="11" w:name="_Toc242810868"/>
       <w:r>
         <w:rPr>
           <w:lang w:val="es-CO"/>
@@ -13526,7 +13540,7 @@
           <w:lang w:val="es-CO"/>
         </w:rPr>
       </w:pPr>
-      <w:bookmarkStart w:id="12" w:name="_Toc242804631"/>
+      <w:bookmarkStart w:id="12" w:name="_Toc242810869"/>
       <w:r>
         <w:rPr>
           <w:lang w:val="es-CO"/>
@@ -13803,7 +13817,7 @@
       <w:pPr>
         <w:pStyle w:val="Ttulo2"/>
       </w:pPr>
-      <w:bookmarkStart w:id="13" w:name="_Toc242804632"/>
+      <w:bookmarkStart w:id="13" w:name="_Toc242810870"/>
       <w:r>
         <w:lastRenderedPageBreak/>
         <w:t>1.5. ESCENA PUENTE I — DEL FUEGO AL ALIMENTO</w:t>
@@ -14036,7 +14050,7 @@
       <w:pPr>
         <w:pStyle w:val="Ttulo2"/>
       </w:pPr>
-      <w:bookmarkStart w:id="14" w:name="_Toc242804633"/>
+      <w:bookmarkStart w:id="14" w:name="_Toc242810871"/>
       <w:r>
         <w:t>1.6. NIVEL 2 — LA RUEDA</w:t>
       </w:r>
@@ -14682,7 +14696,7 @@
           <w:lang w:val="es-CO"/>
         </w:rPr>
       </w:pPr>
-      <w:bookmarkStart w:id="15" w:name="_Toc242804634"/>
+      <w:bookmarkStart w:id="15" w:name="_Toc242810872"/>
       <w:r>
         <w:rPr>
           <w:lang w:val="es-CO"/>
@@ -15946,7 +15960,7 @@
           <w:lang w:val="es-CO"/>
         </w:rPr>
       </w:pPr>
-      <w:bookmarkStart w:id="16" w:name="_Toc242804635"/>
+      <w:bookmarkStart w:id="16" w:name="_Toc242810873"/>
       <w:r>
         <w:rPr>
           <w:lang w:val="es-CO"/>
@@ -17732,7 +17746,7 @@
           <w:lang w:val="es-CO"/>
         </w:rPr>
       </w:pPr>
-      <w:bookmarkStart w:id="17" w:name="_Toc242804636"/>
+      <w:bookmarkStart w:id="17" w:name="_Toc242810874"/>
       <w:r>
         <w:rPr>
           <w:lang w:val="es-CO"/>
@@ -18755,7 +18769,7 @@
           <w:lang w:val="es-CO"/>
         </w:rPr>
       </w:pPr>
-      <w:bookmarkStart w:id="18" w:name="_Toc242804637"/>
+      <w:bookmarkStart w:id="18" w:name="_Toc242810875"/>
       <w:r>
         <w:rPr>
           <w:lang w:val="es-CO"/>
@@ -18824,7 +18838,7 @@
       <w:pPr>
         <w:pStyle w:val="Ttulo2"/>
       </w:pPr>
-      <w:bookmarkStart w:id="19" w:name="_Toc242804638"/>
+      <w:bookmarkStart w:id="19" w:name="_Toc242810876"/>
       <w:r>
         <w:t>1.7. ESCENA PUENTE II — DEL REFUGIO AL RÍO</w:t>
       </w:r>
@@ -19108,7 +19122,7 @@
       <w:pPr>
         <w:pStyle w:val="Ttulo2"/>
       </w:pPr>
-      <w:bookmarkStart w:id="20" w:name="_Toc242804639"/>
+      <w:bookmarkStart w:id="20" w:name="_Toc242810877"/>
       <w:r>
         <w:t>1.8. NIVEL 3 — EL RÍO</w:t>
       </w:r>
@@ -19668,7 +19682,7 @@
           <w:lang w:val="es-CO"/>
         </w:rPr>
       </w:pPr>
-      <w:bookmarkStart w:id="21" w:name="_Toc242804640"/>
+      <w:bookmarkStart w:id="21" w:name="_Toc242810878"/>
       <w:r>
         <w:rPr>
           <w:lang w:val="es-CO"/>
@@ -20135,7 +20149,7 @@
           <w:lang w:val="es-CO"/>
         </w:rPr>
       </w:pPr>
-      <w:bookmarkStart w:id="22" w:name="_Toc242804641"/>
+      <w:bookmarkStart w:id="22" w:name="_Toc242810879"/>
       <w:r>
         <w:rPr>
           <w:lang w:val="es-CO"/>
@@ -20735,7 +20749,7 @@
           <w:bCs w:val="0"/>
         </w:rPr>
       </w:pPr>
-      <w:bookmarkStart w:id="23" w:name="_Toc242804642"/>
+      <w:bookmarkStart w:id="23" w:name="_Toc242810880"/>
       <w:r>
         <w:t>1.8.3 Mecánica del ensamblaje por fases</w:t>
       </w:r>
@@ -21374,7 +21388,7 @@
           <w:bCs w:val="0"/>
         </w:rPr>
       </w:pPr>
-      <w:bookmarkStart w:id="24" w:name="_Toc242804643"/>
+      <w:bookmarkStart w:id="24" w:name="_Toc242810881"/>
       <w:r>
         <w:t>1.8.4 Mecánica de prueba y depuración</w:t>
       </w:r>
@@ -22386,7 +22400,7 @@
       <w:pPr>
         <w:pStyle w:val="Ttulo2"/>
       </w:pPr>
-      <w:bookmarkStart w:id="25" w:name="_Toc242804644"/>
+      <w:bookmarkStart w:id="25" w:name="_Toc242810882"/>
       <w:r>
         <w:t>1.9. ESCENA FINAL</w:t>
       </w:r>
@@ -22507,7 +22521,7 @@
       <w:pPr>
         <w:pStyle w:val="Ttulo2"/>
       </w:pPr>
-      <w:bookmarkStart w:id="26" w:name="_Toc242804645"/>
+      <w:bookmarkStart w:id="26" w:name="_Toc242810883"/>
       <w:r>
         <w:t>1.10. CONTENIDO OPCIONAL FUERA DEL ALCANCE DEL PROTOTIPO</w:t>
       </w:r>
@@ -23020,7 +23034,7 @@
       <w:pPr>
         <w:pStyle w:val="Ttulo2"/>
       </w:pPr>
-      <w:bookmarkStart w:id="27" w:name="_Toc242804646"/>
+      <w:bookmarkStart w:id="27" w:name="_Toc242810884"/>
       <w:r>
         <w:t>1.11. TRAZABILIDAD ENTRE ESCENAS, MECÁNICAS Y REQUERIMIENTOS</w:t>
       </w:r>
@@ -25763,7 +25777,7 @@
           <w:bCs w:val="0"/>
         </w:rPr>
       </w:pPr>
-      <w:bookmarkStart w:id="28" w:name="_Toc242804647"/>
+      <w:bookmarkStart w:id="28" w:name="_Toc242810885"/>
       <w:r>
         <w:t>1.2. PUNTOS ABIERTOS DEL GUION</w:t>
       </w:r>
@@ -26980,7 +26994,7 @@
       <w:pPr>
         <w:pStyle w:val="Ttulo1"/>
       </w:pPr>
-      <w:bookmarkStart w:id="29" w:name="_Toc242804648"/>
+      <w:bookmarkStart w:id="29" w:name="_Toc242810886"/>
       <w:r>
         <w:t>2. CASOS DE USO</w:t>
       </w:r>
@@ -26996,7 +27010,7 @@
           <w:lang w:val="en-US"/>
         </w:rPr>
       </w:pPr>
-      <w:bookmarkStart w:id="30" w:name="_Toc242804649"/>
+      <w:bookmarkStart w:id="30" w:name="_Toc242810887"/>
       <w:r>
         <w:rPr>
           <w:sz w:val="24"/>
@@ -27240,7 +27254,7 @@
           <w:lang w:val="en-US"/>
         </w:rPr>
       </w:pPr>
-      <w:bookmarkStart w:id="31" w:name="_Toc242804650"/>
+      <w:bookmarkStart w:id="31" w:name="_Toc242810888"/>
       <w:r>
         <w:rPr>
           <w:sz w:val="24"/>
@@ -28537,7 +28551,7 @@
           <w:szCs w:val="24"/>
         </w:rPr>
       </w:pPr>
-      <w:bookmarkStart w:id="32" w:name="_Toc242804651"/>
+      <w:bookmarkStart w:id="32" w:name="_Toc242810889"/>
       <w:r>
         <w:rPr>
           <w:sz w:val="24"/>
@@ -35964,7 +35978,7 @@
       <w:pPr>
         <w:pStyle w:val="Ttulo1"/>
       </w:pPr>
-      <w:bookmarkStart w:id="33" w:name="_Toc242804652"/>
+      <w:bookmarkStart w:id="33" w:name="_Toc242810890"/>
       <w:r>
         <w:t>2. HISTORIAS DE USUARIO</w:t>
       </w:r>
@@ -37452,7 +37466,7 @@
       <w:pPr>
         <w:pStyle w:val="Ttulo1"/>
       </w:pPr>
-      <w:bookmarkStart w:id="34" w:name="_Toc242804653"/>
+      <w:bookmarkStart w:id="34" w:name="_Toc242810891"/>
       <w:r>
         <w:t>3. MATRIZ DE TRAZABILIDAD</w:t>
       </w:r>
@@ -37479,7 +37493,7 @@
           <w:szCs w:val="24"/>
         </w:rPr>
       </w:pPr>
-      <w:bookmarkStart w:id="35" w:name="_Toc242804654"/>
+      <w:bookmarkStart w:id="35" w:name="_Toc242810892"/>
       <w:r>
         <w:rPr>
           <w:sz w:val="24"/>
@@ -38354,7 +38368,7 @@
           <w:lang w:val="en-US"/>
         </w:rPr>
       </w:pPr>
-      <w:bookmarkStart w:id="36" w:name="_Toc242804655"/>
+      <w:bookmarkStart w:id="36" w:name="_Toc242810893"/>
       <w:r>
         <w:rPr>
           <w:sz w:val="24"/>
@@ -39221,7 +39235,7 @@
           <w:lang w:val="en-US"/>
         </w:rPr>
       </w:pPr>
-      <w:bookmarkStart w:id="37" w:name="_Toc242804656"/>
+      <w:bookmarkStart w:id="37" w:name="_Toc242810894"/>
       <w:r>
         <w:rPr>
           <w:sz w:val="24"/>
@@ -40181,7 +40195,7 @@
           <w:lang w:val="en-US"/>
         </w:rPr>
       </w:pPr>
-      <w:bookmarkStart w:id="38" w:name="_Toc242804657"/>
+      <w:bookmarkStart w:id="38" w:name="_Toc242810895"/>
       <w:r>
         <w:rPr>
           <w:sz w:val="24"/>
@@ -40766,7 +40780,7 @@
           <w:szCs w:val="24"/>
         </w:rPr>
       </w:pPr>
-      <w:bookmarkStart w:id="39" w:name="_Toc242804658"/>
+      <w:bookmarkStart w:id="39" w:name="_Toc242810896"/>
       <w:r>
         <w:rPr>
           <w:sz w:val="24"/>
@@ -42464,7 +42478,7 @@
           <w:szCs w:val="24"/>
         </w:rPr>
       </w:pPr>
-      <w:bookmarkStart w:id="40" w:name="_Toc242804659"/>
+      <w:bookmarkStart w:id="40" w:name="_Toc242810897"/>
       <w:r>
         <w:rPr>
           <w:sz w:val="24"/>
@@ -43166,7 +43180,7 @@
       <w:pPr>
         <w:pStyle w:val="Ttulo1"/>
       </w:pPr>
-      <w:bookmarkStart w:id="41" w:name="_Toc242804660"/>
+      <w:bookmarkStart w:id="41" w:name="_Toc242810898"/>
       <w:r>
         <w:lastRenderedPageBreak/>
         <w:t>4. ARQUITECTURA DE SOFTWARE</w:t>
@@ -43181,7 +43195,7 @@
           <w:bCs w:val="0"/>
         </w:rPr>
       </w:pPr>
-      <w:bookmarkStart w:id="42" w:name="_Toc242804661"/>
+      <w:bookmarkStart w:id="42" w:name="_Toc242810899"/>
       <w:r>
         <w:t>4.1 Decisión arquitectónica</w:t>
       </w:r>
@@ -43261,7 +43275,7 @@
           <w:bCs w:val="0"/>
         </w:rPr>
       </w:pPr>
-      <w:bookmarkStart w:id="43" w:name="_Toc242804662"/>
+      <w:bookmarkStart w:id="43" w:name="_Toc242810900"/>
       <w:r>
         <w:t>4.2 Patrones que componen la arquitectura</w:t>
       </w:r>
@@ -43416,7 +43430,7 @@
           <w:bCs w:val="0"/>
         </w:rPr>
       </w:pPr>
-      <w:bookmarkStart w:id="44" w:name="_Toc242804663"/>
+      <w:bookmarkStart w:id="44" w:name="_Toc242810901"/>
       <w:r>
         <w:t>4.3 Flujo de estados del juego</w:t>
       </w:r>
@@ -43803,7 +43817,7 @@
           <w:bCs w:val="0"/>
         </w:rPr>
       </w:pPr>
-      <w:bookmarkStart w:id="45" w:name="_Toc242804664"/>
+      <w:bookmarkStart w:id="45" w:name="_Toc242810902"/>
       <w:r>
         <w:t>4.4 Módulos principales del sistema</w:t>
       </w:r>
@@ -44115,7 +44129,7 @@
           <w:bCs w:val="0"/>
         </w:rPr>
       </w:pPr>
-      <w:bookmarkStart w:id="46" w:name="_Toc242804665"/>
+      <w:bookmarkStart w:id="46" w:name="_Toc242810903"/>
       <w:r>
         <w:t>4.5 Justificación frente a otras alternativas</w:t>
       </w:r>
@@ -44272,7 +44286,7 @@
           <w:szCs w:val="22"/>
         </w:rPr>
       </w:pPr>
-      <w:bookmarkStart w:id="47" w:name="_Toc242804666"/>
+      <w:bookmarkStart w:id="47" w:name="_Toc242810904"/>
       <w:r>
         <w:t>5. CONTROL DE CAMBIOS</w:t>
       </w:r>
@@ -44928,6 +44942,73 @@
                 <w:lang w:val="es-ES"/>
               </w:rPr>
               <w:t>Cierra INC-157. Vocabulario adaptado a estudiantes de grado quinto tras la sesión de evaluación. Guion 1.3.1, 1.4.1, 1.4.2, 1.4.4, 1.5, 1.6.1, 1.7, 1.8.1, 1.8.2, 1.8.4 y 1.9: intemperie, maleza, silueta, estela, crepita, irregulares, abruptamente, estabilidad, civilización (en las narraciones de 1.7, 1.8.4 y 1.9) y computacionalmente, entre otras, y la tarea «Armar la balsa» en lugar de «Ensamblar la balsa». No cambia ninguna mecánica ni requisito.</w:t>
+            </w:r>
+          </w:p>
+        </w:tc>
+        <w:tc>
+          <w:tcPr>
+            <w:tcW w:w="2670" w:type="dxa"/>
+          </w:tcPr>
+          <w:p>
+            <w:pPr>
+              <w:rPr>
+                <w:sz w:val="20"/>
+                <w:szCs w:val="20"/>
+              </w:rPr>
+            </w:pPr>
+            <w:r>
+              <w:rPr>
+                <w:sz w:val="20"/>
+                <w:szCs w:val="20"/>
+              </w:rPr>
+              <w:t>Santiago Benavides Rey / Santiago Valdiri García</w:t>
+            </w:r>
+          </w:p>
+        </w:tc>
+      </w:tr>
+      <w:tr>
+        <w:trPr>
+          <w:trHeight w:val="300"/>
+        </w:trPr>
+        <w:tc>
+          <w:tcPr>
+            <w:tcW w:w="1395" w:type="dxa"/>
+          </w:tcPr>
+          <w:p>
+            <w:pPr>
+              <w:rPr>
+                <w:sz w:val="20"/>
+                <w:szCs w:val="20"/>
+              </w:rPr>
+            </w:pPr>
+            <w:r>
+              <w:rPr>
+                <w:sz w:val="20"/>
+                <w:szCs w:val="20"/>
+              </w:rPr>
+              <w:t>13/10/2026</w:t>
+            </w:r>
+          </w:p>
+        </w:tc>
+        <w:tc>
+          <w:tcPr>
+            <w:tcW w:w="5385" w:type="dxa"/>
+          </w:tcPr>
+          <w:p>
+            <w:pPr>
+              <w:rPr>
+                <w:sz w:val="20"/>
+                <w:szCs w:val="20"/>
+                <w:lang w:val="es-ES"/>
+              </w:rPr>
+            </w:pPr>
+            <w:r>
+              <w:rPr>
+                <w:sz w:val="20"/>
+                <w:szCs w:val="20"/>
+                <w:lang w:val="es-ES"/>
+              </w:rPr>
+              <w:t>Población objetivo: grado quinto, conforme a la autorización institucional del 17/09/2026 (INC-151). Afecta el guion 1.1, ficha general del videojuego (público).</w:t>
             </w:r>
           </w:p>
         </w:tc>

</xml_diff>